<commit_message>
feat(main):STP protocol.Link aggregation added
</commit_message>
<xml_diff>
--- a/labs/STP protocol. Link aggregation./report/report.docx
+++ b/labs/STP protocol. Link aggregation./report/report.docx
@@ -198,7 +198,7 @@
       </w:r>
     </w:p>
     <w:bookmarkEnd w:id="21"/>
-    <w:bookmarkStart w:id="93" w:name="протокол-stp"/>
+    <w:bookmarkStart w:id="105" w:name="протокол-stp"/>
     <w:p>
       <w:pPr>
         <w:pStyle w:val="Heading1"/>
@@ -560,7 +560,7 @@
       </w:r>
     </w:p>
     <w:bookmarkEnd w:id="27"/>
-    <w:bookmarkStart w:id="32" w:name="bpdu-кадры"/>
+    <w:bookmarkStart w:id="33" w:name="bpdu-кадры"/>
     <w:p>
       <w:pPr>
         <w:pStyle w:val="Heading2"/>
@@ -1094,62 +1094,278 @@
         <w:t xml:space="preserve">(Configuration BPDU).</w:t>
       </w:r>
     </w:p>
-    <w:p>
-      <w:pPr>
-        <w:pStyle w:val="FirstParagraph"/>
-      </w:pPr>
-      <w:r>
-        <w:t xml:space="preserve">: Флаги BPDU {#tbl:BPDU}</w:t>
-      </w:r>
-      <w:r>
-        <w:t xml:space="preserve"> </w:t>
-      </w:r>
-      <w:r>
-        <w:t xml:space="preserve">| Бит | Обозначение | Описание |</w:t>
-      </w:r>
-      <w:r>
-        <w:t xml:space="preserve"> </w:t>
-      </w:r>
-      <w:r>
-        <w:t xml:space="preserve">|—–|————-|———-|</w:t>
-      </w:r>
-      <w:r>
-        <w:t xml:space="preserve"> </w:t>
-      </w:r>
-      <w:r>
-        <w:t xml:space="preserve">| T | Topology Change | Флаг изменения топологии |</w:t>
-      </w:r>
-      <w:r>
-        <w:t xml:space="preserve"> </w:t>
-      </w:r>
-      <w:r>
-        <w:t xml:space="preserve">| P | Proposal | Используется в RSTP для быстрого перехода |</w:t>
-      </w:r>
-      <w:r>
-        <w:t xml:space="preserve"> </w:t>
-      </w:r>
-      <w:r>
-        <w:t xml:space="preserve">| L | Learning | Порт в состоянии обучения |</w:t>
-      </w:r>
-      <w:r>
-        <w:t xml:space="preserve"> </w:t>
-      </w:r>
-      <w:r>
-        <w:t xml:space="preserve">| F | Forwarding | Порт пересылает данные |</w:t>
-      </w:r>
-      <w:r>
-        <w:t xml:space="preserve"> </w:t>
-      </w:r>
-      <w:r>
-        <w:t xml:space="preserve">| A | Agreement | Подтверждение в RSTP |</w:t>
-      </w:r>
-      <w:r>
-        <w:t xml:space="preserve"> </w:t>
-      </w:r>
-      <w:r>
-        <w:t xml:space="preserve">| T | TCA (Topology Change Ack) | Подтверждение уведомления о изменении |</w:t>
-      </w:r>
-    </w:p>
+    <w:bookmarkStart w:id="32" w:name="tbl:BPDU"/>
+    <w:p>
+      <w:pPr>
+        <w:pStyle w:val="TableCaption"/>
+      </w:pPr>
+      <w:r>
+        <w:t xml:space="preserve">Таблица 1: Флаги BPDU</w:t>
+      </w:r>
+    </w:p>
+    <w:tbl>
+      <w:tblPr>
+        <w:tblStyle w:val="Table"/>
+        <w:tblW w:type="pct" w:w="5000"/>
+        <w:tblLayout w:type="fixed"/>
+        <w:tblLook w:firstRow="1" w:lastRow="0" w:firstColumn="0" w:lastColumn="0" w:noHBand="0" w:noVBand="0" w:val="0020"/>
+        <w:tblCaption w:val="Таблица 1: Флаги BPDU"/>
+      </w:tblPr>
+      <w:tblGrid>
+        <w:gridCol w:w="1414"/>
+        <w:gridCol w:w="3677"/>
+        <w:gridCol w:w="2828"/>
+      </w:tblGrid>
+      <w:tr>
+        <w:trPr>
+          <w:tblHeader w:val="on"/>
+        </w:trPr>
+        <w:tc>
+          <w:tcPr/>
+          <w:p>
+            <w:pPr>
+              <w:pStyle w:val="Compact"/>
+            </w:pPr>
+            <w:r>
+              <w:t xml:space="preserve">Бит</w:t>
+            </w:r>
+          </w:p>
+        </w:tc>
+        <w:tc>
+          <w:tcPr/>
+          <w:p>
+            <w:pPr>
+              <w:pStyle w:val="Compact"/>
+            </w:pPr>
+            <w:r>
+              <w:t xml:space="preserve">Обозначение</w:t>
+            </w:r>
+          </w:p>
+        </w:tc>
+        <w:tc>
+          <w:tcPr/>
+          <w:p>
+            <w:pPr>
+              <w:pStyle w:val="Compact"/>
+            </w:pPr>
+            <w:r>
+              <w:t xml:space="preserve">Описание</w:t>
+            </w:r>
+          </w:p>
+        </w:tc>
+      </w:tr>
+      <w:tr>
+        <w:tc>
+          <w:tcPr/>
+          <w:p>
+            <w:pPr>
+              <w:pStyle w:val="Compact"/>
+            </w:pPr>
+            <w:r>
+              <w:t xml:space="preserve">T</w:t>
+            </w:r>
+          </w:p>
+        </w:tc>
+        <w:tc>
+          <w:tcPr/>
+          <w:p>
+            <w:pPr>
+              <w:pStyle w:val="Compact"/>
+            </w:pPr>
+            <w:r>
+              <w:t xml:space="preserve">Topology Change</w:t>
+            </w:r>
+          </w:p>
+        </w:tc>
+        <w:tc>
+          <w:tcPr/>
+          <w:p>
+            <w:pPr>
+              <w:pStyle w:val="Compact"/>
+            </w:pPr>
+            <w:r>
+              <w:t xml:space="preserve">Флаг изменения топологии</w:t>
+            </w:r>
+          </w:p>
+        </w:tc>
+      </w:tr>
+      <w:tr>
+        <w:tc>
+          <w:tcPr/>
+          <w:p>
+            <w:pPr>
+              <w:pStyle w:val="Compact"/>
+            </w:pPr>
+            <w:r>
+              <w:t xml:space="preserve">P</w:t>
+            </w:r>
+          </w:p>
+        </w:tc>
+        <w:tc>
+          <w:tcPr/>
+          <w:p>
+            <w:pPr>
+              <w:pStyle w:val="Compact"/>
+            </w:pPr>
+            <w:r>
+              <w:t xml:space="preserve">Proposal</w:t>
+            </w:r>
+          </w:p>
+        </w:tc>
+        <w:tc>
+          <w:tcPr/>
+          <w:p>
+            <w:pPr>
+              <w:pStyle w:val="Compact"/>
+            </w:pPr>
+            <w:r>
+              <w:t xml:space="preserve">Используется в RSTP для быстрого перехода</w:t>
+            </w:r>
+          </w:p>
+        </w:tc>
+      </w:tr>
+      <w:tr>
+        <w:tc>
+          <w:tcPr/>
+          <w:p>
+            <w:pPr>
+              <w:pStyle w:val="Compact"/>
+            </w:pPr>
+            <w:r>
+              <w:t xml:space="preserve">L</w:t>
+            </w:r>
+          </w:p>
+        </w:tc>
+        <w:tc>
+          <w:tcPr/>
+          <w:p>
+            <w:pPr>
+              <w:pStyle w:val="Compact"/>
+            </w:pPr>
+            <w:r>
+              <w:t xml:space="preserve">Learning</w:t>
+            </w:r>
+          </w:p>
+        </w:tc>
+        <w:tc>
+          <w:tcPr/>
+          <w:p>
+            <w:pPr>
+              <w:pStyle w:val="Compact"/>
+            </w:pPr>
+            <w:r>
+              <w:t xml:space="preserve">Порт в состоянии обучения</w:t>
+            </w:r>
+          </w:p>
+        </w:tc>
+      </w:tr>
+      <w:tr>
+        <w:tc>
+          <w:tcPr/>
+          <w:p>
+            <w:pPr>
+              <w:pStyle w:val="Compact"/>
+            </w:pPr>
+            <w:r>
+              <w:t xml:space="preserve">F</w:t>
+            </w:r>
+          </w:p>
+        </w:tc>
+        <w:tc>
+          <w:tcPr/>
+          <w:p>
+            <w:pPr>
+              <w:pStyle w:val="Compact"/>
+            </w:pPr>
+            <w:r>
+              <w:t xml:space="preserve">Forwarding</w:t>
+            </w:r>
+          </w:p>
+        </w:tc>
+        <w:tc>
+          <w:tcPr/>
+          <w:p>
+            <w:pPr>
+              <w:pStyle w:val="Compact"/>
+            </w:pPr>
+            <w:r>
+              <w:t xml:space="preserve">Порт пересылает данные</w:t>
+            </w:r>
+          </w:p>
+        </w:tc>
+      </w:tr>
+      <w:tr>
+        <w:tc>
+          <w:tcPr/>
+          <w:p>
+            <w:pPr>
+              <w:pStyle w:val="Compact"/>
+            </w:pPr>
+            <w:r>
+              <w:t xml:space="preserve">A</w:t>
+            </w:r>
+          </w:p>
+        </w:tc>
+        <w:tc>
+          <w:tcPr/>
+          <w:p>
+            <w:pPr>
+              <w:pStyle w:val="Compact"/>
+            </w:pPr>
+            <w:r>
+              <w:t xml:space="preserve">Agreement</w:t>
+            </w:r>
+          </w:p>
+        </w:tc>
+        <w:tc>
+          <w:tcPr/>
+          <w:p>
+            <w:pPr>
+              <w:pStyle w:val="Compact"/>
+            </w:pPr>
+            <w:r>
+              <w:t xml:space="preserve">Подтверждение в RSTP</w:t>
+            </w:r>
+          </w:p>
+        </w:tc>
+      </w:tr>
+      <w:tr>
+        <w:tc>
+          <w:tcPr/>
+          <w:p>
+            <w:pPr>
+              <w:pStyle w:val="Compact"/>
+            </w:pPr>
+            <w:r>
+              <w:t xml:space="preserve">T</w:t>
+            </w:r>
+          </w:p>
+        </w:tc>
+        <w:tc>
+          <w:tcPr/>
+          <w:p>
+            <w:pPr>
+              <w:pStyle w:val="Compact"/>
+            </w:pPr>
+            <w:r>
+              <w:t xml:space="preserve">TCA (Topology Change Ack)</w:t>
+            </w:r>
+          </w:p>
+        </w:tc>
+        <w:tc>
+          <w:tcPr/>
+          <w:p>
+            <w:pPr>
+              <w:pStyle w:val="Compact"/>
+            </w:pPr>
+            <w:r>
+              <w:t xml:space="preserve">Подтверждение уведомления о изменении</w:t>
+            </w:r>
+          </w:p>
+        </w:tc>
+      </w:tr>
+    </w:tbl>
+    <w:bookmarkEnd w:id="32"/>
     <w:p>
       <w:pPr>
         <w:pStyle w:val="Compact"/>
@@ -1649,8 +1865,8 @@
         <w:t xml:space="preserve">: Если Bridge ID совпадает с Root ID, это означает, что коммутатор, отправивший BPDU, является корневым мостом в сети.</w:t>
       </w:r>
     </w:p>
-    <w:bookmarkEnd w:id="32"/>
-    <w:bookmarkStart w:id="33" w:name="разновидности-stp"/>
+    <w:bookmarkEnd w:id="33"/>
+    <w:bookmarkStart w:id="38" w:name="работа-stp-на-разных-уровнях"/>
     <w:p>
       <w:pPr>
         <w:pStyle w:val="Heading2"/>
@@ -1665,7 +1881,25 @@
         <w:tab/>
       </w:r>
       <w:r>
-        <w:t xml:space="preserve">Разновидности STP</w:t>
+        <w:t xml:space="preserve">Работа STP на разных уровнях</w:t>
+      </w:r>
+    </w:p>
+    <w:bookmarkStart w:id="34" w:name="stp-и-уровни-модели-osi"/>
+    <w:p>
+      <w:pPr>
+        <w:pStyle w:val="Heading3"/>
+      </w:pPr>
+      <w:r>
+        <w:rPr>
+          <w:rStyle w:val="SectionNumber"/>
+        </w:rPr>
+        <w:t xml:space="preserve">3.4.1</w:t>
+      </w:r>
+      <w:r>
+        <w:tab/>
+      </w:r>
+      <w:r>
+        <w:t xml:space="preserve">STP и уровни модели OSI</w:t>
       </w:r>
     </w:p>
     <w:p>
@@ -1676,7 +1910,17 @@
         </w:numPr>
       </w:pPr>
       <w:r>
-        <w:t xml:space="preserve">CST (Classic STP) — одно дерево для всей сети;</w:t>
+        <w:rPr>
+          <w:b/>
+          <w:bCs/>
+        </w:rPr>
+        <w:t xml:space="preserve">STP работает на канальном уровне (L2)</w:t>
+      </w:r>
+      <w:r>
+        <w:t xml:space="preserve"> </w:t>
+      </w:r>
+      <w:r>
+        <w:t xml:space="preserve">— оперирует MAC-адресами и BPDU (Bridge Protocol Data Units).</w:t>
       </w:r>
     </w:p>
     <w:p>
@@ -1687,48 +1931,17 @@
         </w:numPr>
       </w:pPr>
       <w:r>
-        <w:t xml:space="preserve">PVST+ (Per-VLAN STP) — отдельное дерево для каждого VLAN (используется в Cisco);</w:t>
-      </w:r>
-    </w:p>
-    <w:p>
-      <w:pPr>
-        <w:numPr>
-          <w:ilvl w:val="0"/>
-          <w:numId w:val="1025"/>
-        </w:numPr>
-      </w:pPr>
-      <w:r>
-        <w:t xml:space="preserve">RSTP (Rapid STP) — ускоренная версия с временем сходимости 1-2 секунды;</w:t>
-      </w:r>
-    </w:p>
-    <w:p>
-      <w:pPr>
-        <w:numPr>
-          <w:ilvl w:val="0"/>
-          <w:numId w:val="1025"/>
-        </w:numPr>
-      </w:pPr>
-      <w:r>
-        <w:t xml:space="preserve">MSTP (Multiple STP) — объединение нескольких VLAN в одно дерево.</w:t>
-      </w:r>
-    </w:p>
-    <w:bookmarkEnd w:id="33"/>
-    <w:bookmarkStart w:id="66" w:name="изучение-принципов-работы-stp"/>
-    <w:p>
-      <w:pPr>
-        <w:pStyle w:val="Heading2"/>
-      </w:pPr>
-      <w:r>
-        <w:rPr>
-          <w:rStyle w:val="SectionNumber"/>
-        </w:rPr>
-        <w:t xml:space="preserve">3.5</w:t>
-      </w:r>
-      <w:r>
-        <w:tab/>
-      </w:r>
-      <w:r>
-        <w:t xml:space="preserve">Изучение принципов работы STP</w:t>
+        <w:rPr>
+          <w:b/>
+          <w:bCs/>
+        </w:rPr>
+        <w:t xml:space="preserve">Но зависит от физической топологии (L1)</w:t>
+      </w:r>
+      <w:r>
+        <w:t xml:space="preserve"> </w:t>
+      </w:r>
+      <w:r>
+        <w:t xml:space="preserve">— если кабель оборван или порт выключен, STP не сможет построить дерево.</w:t>
       </w:r>
     </w:p>
     <w:p>
@@ -1736,19 +1949,7 @@
         <w:pStyle w:val="FirstParagraph"/>
       </w:pPr>
       <w:r>
-        <w:t xml:space="preserve">Рассмотрим простейший пример тоопологии сети, демонстрирующей работу STP</w:t>
-      </w:r>
-      <w:r>
-        <w:t xml:space="preserve"> </w:t>
-      </w:r>
-      <w:r>
-        <w:t xml:space="preserve">[4]</w:t>
-      </w:r>
-      <w:r>
-        <w:t xml:space="preserve"> </w:t>
-      </w:r>
-      <w:r>
-        <w:t xml:space="preserve">(рис. 3):</w:t>
+        <w:t xml:space="preserve">Почему это важно?</w:t>
       </w:r>
     </w:p>
     <w:p>
@@ -1759,7 +1960,55 @@
         </w:numPr>
       </w:pPr>
       <w:r>
-        <w:t xml:space="preserve">Два коммутатора (Switch0 и Switch1) соединены двумя линками (избыточное соединение)</w:t>
+        <w:t xml:space="preserve">STP</w:t>
+      </w:r>
+      <w:r>
+        <w:t xml:space="preserve"> </w:t>
+      </w:r>
+      <w:r>
+        <w:rPr>
+          <w:b/>
+          <w:bCs/>
+        </w:rPr>
+        <w:t xml:space="preserve">логически</w:t>
+      </w:r>
+      <w:r>
+        <w:t xml:space="preserve"> </w:t>
+      </w:r>
+      <w:r>
+        <w:t xml:space="preserve">блокирует петли (на канальном уровне), но</w:t>
+      </w:r>
+      <w:r>
+        <w:t xml:space="preserve"> </w:t>
+      </w:r>
+      <w:r>
+        <w:rPr>
+          <w:b/>
+          <w:bCs/>
+        </w:rPr>
+        <w:t xml:space="preserve">физически</w:t>
+      </w:r>
+      <w:r>
+        <w:t xml:space="preserve"> </w:t>
+      </w:r>
+      <w:r>
+        <w:t xml:space="preserve">соединение остаётся (порт в состоянии</w:t>
+      </w:r>
+      <w:r>
+        <w:t xml:space="preserve"> </w:t>
+      </w:r>
+      <w:r>
+        <w:rPr>
+          <w:i/>
+          <w:iCs/>
+        </w:rPr>
+        <w:t xml:space="preserve">Blocking</w:t>
+      </w:r>
+      <w:r>
+        <w:t xml:space="preserve"> </w:t>
+      </w:r>
+      <w:r>
+        <w:t xml:space="preserve">всё ещё получает BPDU).</w:t>
       </w:r>
     </w:p>
     <w:p>
@@ -1770,10 +2019,1786 @@
         </w:numPr>
       </w:pPr>
       <w:r>
+        <w:t xml:space="preserve">Если физическая топология не соответствует логической (например, кабель подключён, но STP его</w:t>
+      </w:r>
+      <w:r>
+        <w:t xml:space="preserve"> </w:t>
+      </w:r>
+      <w:r>
+        <w:t xml:space="preserve">“не видит”</w:t>
+      </w:r>
+      <w:r>
+        <w:t xml:space="preserve">), возможны проблемы.</w:t>
+      </w:r>
+    </w:p>
+    <w:bookmarkEnd w:id="34"/>
+    <w:bookmarkStart w:id="35" w:name="как-stp-взаимодействует-с-физикой"/>
+    <w:p>
+      <w:pPr>
+        <w:pStyle w:val="Heading3"/>
+      </w:pPr>
+      <w:r>
+        <w:rPr>
+          <w:rStyle w:val="SectionNumber"/>
+        </w:rPr>
+        <w:t xml:space="preserve">3.4.2</w:t>
+      </w:r>
+      <w:r>
+        <w:tab/>
+      </w:r>
+      <w:r>
+        <w:t xml:space="preserve">Как STP взаимодействует с физикой?</w:t>
+      </w:r>
+    </w:p>
+    <w:p>
+      <w:pPr>
+        <w:numPr>
+          <w:ilvl w:val="0"/>
+          <w:numId w:val="1027"/>
+        </w:numPr>
+      </w:pPr>
+      <w:r>
+        <w:rPr>
+          <w:b/>
+          <w:bCs/>
+        </w:rPr>
+        <w:t xml:space="preserve">Пример 1</w:t>
+      </w:r>
+      <w:r>
+        <w:t xml:space="preserve">:</w:t>
+      </w:r>
+    </w:p>
+    <w:p>
+      <w:pPr>
+        <w:numPr>
+          <w:ilvl w:val="1"/>
+          <w:numId w:val="1028"/>
+        </w:numPr>
+      </w:pPr>
+      <w:r>
+        <w:rPr>
+          <w:b/>
+          <w:bCs/>
+        </w:rPr>
+        <w:t xml:space="preserve">Физическая петля</w:t>
+      </w:r>
+      <w:r>
+        <w:t xml:space="preserve">: Два коммутатора соединены двумя кабелями.</w:t>
+      </w:r>
+    </w:p>
+    <w:p>
+      <w:pPr>
+        <w:numPr>
+          <w:ilvl w:val="1"/>
+          <w:numId w:val="1028"/>
+        </w:numPr>
+      </w:pPr>
+      <w:r>
+        <w:rPr>
+          <w:b/>
+          <w:bCs/>
+        </w:rPr>
+        <w:t xml:space="preserve">STP-реакция</w:t>
+      </w:r>
+      <w:r>
+        <w:t xml:space="preserve">: Один порт перейдёт в состояние</w:t>
+      </w:r>
+      <w:r>
+        <w:t xml:space="preserve"> </w:t>
+      </w:r>
+      <w:r>
+        <w:rPr>
+          <w:i/>
+          <w:iCs/>
+        </w:rPr>
+        <w:t xml:space="preserve">Blocking</w:t>
+      </w:r>
+      <w:r>
+        <w:t xml:space="preserve">, чтобы избежать петли на канальном уровне.</w:t>
+      </w:r>
+    </w:p>
+    <w:p>
+      <w:pPr>
+        <w:numPr>
+          <w:ilvl w:val="0"/>
+          <w:numId w:val="1027"/>
+        </w:numPr>
+      </w:pPr>
+      <w:r>
+        <w:rPr>
+          <w:b/>
+          <w:bCs/>
+        </w:rPr>
+        <w:t xml:space="preserve">Пример 2 (проблема)</w:t>
+      </w:r>
+      <w:r>
+        <w:t xml:space="preserve">:</w:t>
+      </w:r>
+    </w:p>
+    <w:p>
+      <w:pPr>
+        <w:pStyle w:val="Compact"/>
+        <w:numPr>
+          <w:ilvl w:val="1"/>
+          <w:numId w:val="1029"/>
+        </w:numPr>
+      </w:pPr>
+      <w:r>
+        <w:t xml:space="preserve">Если</w:t>
+      </w:r>
+      <w:r>
+        <w:t xml:space="preserve"> </w:t>
+      </w:r>
+      <w:r>
+        <w:rPr>
+          <w:b/>
+          <w:bCs/>
+        </w:rPr>
+        <w:t xml:space="preserve">физическое соединение есть</w:t>
+      </w:r>
+      <w:r>
+        <w:t xml:space="preserve">, но</w:t>
+      </w:r>
+      <w:r>
+        <w:t xml:space="preserve"> </w:t>
+      </w:r>
+      <w:r>
+        <w:rPr>
+          <w:b/>
+          <w:bCs/>
+        </w:rPr>
+        <w:t xml:space="preserve">STP не работает</w:t>
+      </w:r>
+      <w:r>
+        <w:t xml:space="preserve"> </w:t>
+      </w:r>
+      <w:r>
+        <w:t xml:space="preserve">(например, отключён на одном коммутаторе) — возникнет broadcast-шторм.</w:t>
+      </w:r>
+    </w:p>
+    <w:bookmarkEnd w:id="35"/>
+    <w:bookmarkStart w:id="37" w:name="где-stp-не-видит-физику"/>
+    <w:p>
+      <w:pPr>
+        <w:pStyle w:val="Heading3"/>
+      </w:pPr>
+      <w:r>
+        <w:rPr>
+          <w:rStyle w:val="SectionNumber"/>
+        </w:rPr>
+        <w:t xml:space="preserve">3.4.3</w:t>
+      </w:r>
+      <w:r>
+        <w:tab/>
+      </w:r>
+      <w:r>
+        <w:t xml:space="preserve">Где STP</w:t>
+      </w:r>
+      <w:r>
+        <w:t xml:space="preserve"> </w:t>
+      </w:r>
+      <w:r>
+        <w:t xml:space="preserve">“не видит”</w:t>
+      </w:r>
+      <w:r>
+        <w:t xml:space="preserve"> </w:t>
+      </w:r>
+      <w:r>
+        <w:t xml:space="preserve">физику?</w:t>
+      </w:r>
+    </w:p>
+    <w:p>
+      <w:pPr>
+        <w:numPr>
+          <w:ilvl w:val="0"/>
+          <w:numId w:val="1030"/>
+        </w:numPr>
+      </w:pPr>
+      <w:r>
+        <w:rPr>
+          <w:b/>
+          <w:bCs/>
+        </w:rPr>
+        <w:t xml:space="preserve">Unidirectional links</w:t>
+      </w:r>
+      <w:r>
+        <w:t xml:space="preserve"> </w:t>
+      </w:r>
+      <w:r>
+        <w:t xml:space="preserve">(односторонние кабели):</w:t>
+      </w:r>
+    </w:p>
+    <w:p>
+      <w:pPr>
+        <w:numPr>
+          <w:ilvl w:val="1"/>
+          <w:numId w:val="1031"/>
+        </w:numPr>
+      </w:pPr>
+      <w:r>
+        <w:t xml:space="preserve">Кабель передаёт данные только в одну сторону (например, повреждён).</w:t>
+      </w:r>
+    </w:p>
+    <w:p>
+      <w:pPr>
+        <w:numPr>
+          <w:ilvl w:val="1"/>
+          <w:numId w:val="1031"/>
+        </w:numPr>
+      </w:pPr>
+      <w:r>
+        <w:t xml:space="preserve">STP может не обнаружить проблему, так как BPDU не доходят, и порт остаётся в</w:t>
+      </w:r>
+      <w:r>
+        <w:t xml:space="preserve"> </w:t>
+      </w:r>
+      <w:r>
+        <w:rPr>
+          <w:i/>
+          <w:iCs/>
+        </w:rPr>
+        <w:t xml:space="preserve">Forwarding</w:t>
+      </w:r>
+      <w:r>
+        <w:t xml:space="preserve"> </w:t>
+      </w:r>
+      <m:oMath>
+        <m:r>
+          <m:rPr>
+            <m:sty m:val="p"/>
+          </m:rPr>
+          <m:t>→</m:t>
+        </m:r>
+      </m:oMath>
+      <w:r>
+        <w:t xml:space="preserve"> </w:t>
+      </w:r>
+      <w:r>
+        <w:t xml:space="preserve">петля!</w:t>
+      </w:r>
+    </w:p>
+    <w:p>
+      <w:pPr>
+        <w:numPr>
+          <w:ilvl w:val="1"/>
+          <w:numId w:val="1031"/>
+        </w:numPr>
+      </w:pPr>
+      <w:r>
+        <w:rPr>
+          <w:b/>
+          <w:bCs/>
+        </w:rPr>
+        <w:t xml:space="preserve">Решение</w:t>
+      </w:r>
+      <w:r>
+        <w:t xml:space="preserve">: Использовать</w:t>
+      </w:r>
+      <w:r>
+        <w:t xml:space="preserve"> </w:t>
+      </w:r>
+      <w:r>
+        <w:rPr>
+          <w:b/>
+          <w:bCs/>
+        </w:rPr>
+        <w:t xml:space="preserve">Loop Guard</w:t>
+      </w:r>
+      <w:r>
+        <w:t xml:space="preserve"> </w:t>
+      </w:r>
+      <w:r>
+        <w:t xml:space="preserve">или</w:t>
+      </w:r>
+      <w:r>
+        <w:t xml:space="preserve"> </w:t>
+      </w:r>
+      <w:r>
+        <w:rPr>
+          <w:b/>
+          <w:bCs/>
+        </w:rPr>
+        <w:t xml:space="preserve">UDLD</w:t>
+      </w:r>
+      <w:r>
+        <w:t xml:space="preserve"> </w:t>
+      </w:r>
+      <w:r>
+        <w:t xml:space="preserve">(протоколы для обнаружения таких ситуаций).</w:t>
+      </w:r>
+    </w:p>
+    <w:bookmarkStart w:id="36" w:name="tbl:L2"/>
+    <w:p>
+      <w:pPr>
+        <w:pStyle w:val="TableCaption"/>
+      </w:pPr>
+      <w:r>
+        <w:t xml:space="preserve">Таблица 2: Работа STP</w:t>
+      </w:r>
+    </w:p>
+    <w:tbl>
+      <w:tblPr>
+        <w:tblStyle w:val="Table"/>
+        <w:tblW w:type="pct" w:w="5000"/>
+        <w:tblLayout w:type="fixed"/>
+        <w:tblLook w:firstRow="1" w:lastRow="0" w:firstColumn="0" w:lastColumn="0" w:noHBand="0" w:noVBand="0" w:val="0020"/>
+        <w:tblCaption w:val="Таблица 2: Работа STP"/>
+      </w:tblPr>
+      <w:tblGrid>
+        <w:gridCol w:w="1618"/>
+        <w:gridCol w:w="3065"/>
+        <w:gridCol w:w="3236"/>
+      </w:tblGrid>
+      <w:tr>
+        <w:trPr>
+          <w:tblHeader w:val="on"/>
+        </w:trPr>
+        <w:tc>
+          <w:tcPr/>
+          <w:p>
+            <w:pPr>
+              <w:pStyle w:val="Compact"/>
+            </w:pPr>
+            <w:r>
+              <w:rPr>
+                <w:b/>
+                <w:bCs/>
+              </w:rPr>
+              <w:t xml:space="preserve">Аспект</w:t>
+            </w:r>
+          </w:p>
+        </w:tc>
+        <w:tc>
+          <w:tcPr/>
+          <w:p>
+            <w:pPr>
+              <w:pStyle w:val="Compact"/>
+            </w:pPr>
+            <w:r>
+              <w:rPr>
+                <w:b/>
+                <w:bCs/>
+              </w:rPr>
+              <w:t xml:space="preserve">STP (L2)</w:t>
+            </w:r>
+          </w:p>
+        </w:tc>
+        <w:tc>
+          <w:tcPr/>
+          <w:p>
+            <w:pPr>
+              <w:pStyle w:val="Compact"/>
+            </w:pPr>
+            <w:r>
+              <w:rPr>
+                <w:b/>
+                <w:bCs/>
+              </w:rPr>
+              <w:t xml:space="preserve">Физический уровень (L1)</w:t>
+            </w:r>
+          </w:p>
+        </w:tc>
+      </w:tr>
+      <w:tr>
+        <w:tc>
+          <w:tcPr/>
+          <w:p>
+            <w:pPr>
+              <w:pStyle w:val="Compact"/>
+            </w:pPr>
+            <w:r>
+              <w:rPr>
+                <w:b/>
+                <w:bCs/>
+              </w:rPr>
+              <w:t xml:space="preserve">Что контролирует?</w:t>
+            </w:r>
+          </w:p>
+        </w:tc>
+        <w:tc>
+          <w:tcPr/>
+          <w:p>
+            <w:pPr>
+              <w:pStyle w:val="Compact"/>
+            </w:pPr>
+            <w:r>
+              <w:t xml:space="preserve">Петли на уровне MAC-адресов</w:t>
+            </w:r>
+          </w:p>
+        </w:tc>
+        <w:tc>
+          <w:tcPr/>
+          <w:p>
+            <w:pPr>
+              <w:pStyle w:val="Compact"/>
+            </w:pPr>
+            <w:r>
+              <w:t xml:space="preserve">Целостность кабеля, сигнал</w:t>
+            </w:r>
+          </w:p>
+        </w:tc>
+      </w:tr>
+      <w:tr>
+        <w:tc>
+          <w:tcPr/>
+          <w:p>
+            <w:pPr>
+              <w:pStyle w:val="Compact"/>
+            </w:pPr>
+            <w:r>
+              <w:rPr>
+                <w:b/>
+                <w:bCs/>
+              </w:rPr>
+              <w:t xml:space="preserve">Инструменты</w:t>
+            </w:r>
+          </w:p>
+        </w:tc>
+        <w:tc>
+          <w:tcPr/>
+          <w:p>
+            <w:pPr>
+              <w:pStyle w:val="Compact"/>
+            </w:pPr>
+            <w:r>
+              <w:t xml:space="preserve">BPDU, блокировка портов</w:t>
+            </w:r>
+          </w:p>
+        </w:tc>
+        <w:tc>
+          <w:tcPr/>
+          <w:p>
+            <w:pPr>
+              <w:pStyle w:val="Compact"/>
+            </w:pPr>
+            <w:r>
+              <w:t xml:space="preserve">LED-индикаторы, тестеры кабелей</w:t>
+            </w:r>
+          </w:p>
+        </w:tc>
+      </w:tr>
+      <w:tr>
+        <w:tc>
+          <w:tcPr/>
+          <w:p>
+            <w:pPr>
+              <w:pStyle w:val="Compact"/>
+            </w:pPr>
+            <w:r>
+              <w:rPr>
+                <w:b/>
+                <w:bCs/>
+              </w:rPr>
+              <w:t xml:space="preserve">Если ошибка</w:t>
+            </w:r>
+          </w:p>
+        </w:tc>
+        <w:tc>
+          <w:tcPr/>
+          <w:p>
+            <w:pPr>
+              <w:pStyle w:val="Compact"/>
+            </w:pPr>
+            <w:r>
+              <w:t xml:space="preserve">Порты блокируются</w:t>
+            </w:r>
+          </w:p>
+        </w:tc>
+        <w:tc>
+          <w:tcPr/>
+          <w:p>
+            <w:pPr>
+              <w:pStyle w:val="Compact"/>
+            </w:pPr>
+            <w:r>
+              <w:t xml:space="preserve">Связь пропадает полностью</w:t>
+            </w:r>
+          </w:p>
+        </w:tc>
+      </w:tr>
+    </w:tbl>
+    <w:bookmarkEnd w:id="36"/>
+    <w:p>
+      <w:pPr>
+        <w:pStyle w:val="BodyText"/>
+      </w:pPr>
+      <w:r>
+        <w:rPr>
+          <w:b/>
+          <w:bCs/>
+        </w:rPr>
+        <w:t xml:space="preserve">STP (Spanning Tree Protocol)</w:t>
+      </w:r>
+      <w:r>
+        <w:t xml:space="preserve"> </w:t>
+      </w:r>
+      <w:r>
+        <w:t xml:space="preserve">работает на</w:t>
+      </w:r>
+      <w:r>
+        <w:t xml:space="preserve"> </w:t>
+      </w:r>
+      <w:r>
+        <w:rPr>
+          <w:b/>
+          <w:bCs/>
+        </w:rPr>
+        <w:t xml:space="preserve">втором уровне модели OSI (канальный уровень - Data Link Layer)</w:t>
+      </w:r>
+      <w:r>
+        <w:t xml:space="preserve">.</w:t>
+      </w:r>
+    </w:p>
+    <w:p>
+      <w:pPr>
+        <w:numPr>
+          <w:ilvl w:val="0"/>
+          <w:numId w:val="1032"/>
+        </w:numPr>
+      </w:pPr>
+      <w:r>
+        <w:rPr>
+          <w:b/>
+          <w:bCs/>
+        </w:rPr>
+        <w:t xml:space="preserve">Канальный уровень (L2)</w:t>
+      </w:r>
+      <w:r>
+        <w:t xml:space="preserve"> </w:t>
+      </w:r>
+      <w:r>
+        <w:t xml:space="preserve">отвечает за передачу кадров (frames) между устройствами в одной сети (LAN).</w:t>
+      </w:r>
+    </w:p>
+    <w:p>
+      <w:pPr>
+        <w:numPr>
+          <w:ilvl w:val="0"/>
+          <w:numId w:val="1032"/>
+        </w:numPr>
+      </w:pPr>
+      <w:r>
+        <w:rPr>
+          <w:b/>
+          <w:bCs/>
+        </w:rPr>
+        <w:t xml:space="preserve">STP</w:t>
+      </w:r>
+      <w:r>
+        <w:t xml:space="preserve"> </w:t>
+      </w:r>
+      <w:r>
+        <w:t xml:space="preserve">используется для предотвращения петель (loops) в сетях Ethernet, управляя избыточными соединениями между коммутаторами (L2-устройствами).</w:t>
+      </w:r>
+    </w:p>
+    <w:p>
+      <w:pPr>
+        <w:numPr>
+          <w:ilvl w:val="0"/>
+          <w:numId w:val="1032"/>
+        </w:numPr>
+      </w:pPr>
+      <w:r>
+        <w:rPr>
+          <w:b/>
+          <w:bCs/>
+        </w:rPr>
+        <w:t xml:space="preserve">STP оперирует BPDU (Bridge Protocol Data Units)</w:t>
+      </w:r>
+      <w:r>
+        <w:t xml:space="preserve">, которые передаются между коммутаторами для построения дерева без петель.</w:t>
+      </w:r>
+    </w:p>
+    <w:p>
+      <w:pPr>
+        <w:pStyle w:val="FirstParagraph"/>
+      </w:pPr>
+      <w:r>
+        <w:t xml:space="preserve">Почему не другие уровни?</w:t>
+      </w:r>
+    </w:p>
+    <w:p>
+      <w:pPr>
+        <w:numPr>
+          <w:ilvl w:val="0"/>
+          <w:numId w:val="1033"/>
+        </w:numPr>
+      </w:pPr>
+      <w:r>
+        <w:rPr>
+          <w:b/>
+          <w:bCs/>
+        </w:rPr>
+        <w:t xml:space="preserve">Физический уровень (L1)</w:t>
+      </w:r>
+      <w:r>
+        <w:t xml:space="preserve"> </w:t>
+      </w:r>
+      <w:r>
+        <w:t xml:space="preserve">– STP не работает с битами и физическими соединениями.</w:t>
+      </w:r>
+    </w:p>
+    <w:p>
+      <w:pPr>
+        <w:numPr>
+          <w:ilvl w:val="0"/>
+          <w:numId w:val="1033"/>
+        </w:numPr>
+      </w:pPr>
+      <w:r>
+        <w:rPr>
+          <w:b/>
+          <w:bCs/>
+        </w:rPr>
+        <w:t xml:space="preserve">Сетевой уровень (L3) и выше</w:t>
+      </w:r>
+      <w:r>
+        <w:t xml:space="preserve"> </w:t>
+      </w:r>
+      <w:r>
+        <w:t xml:space="preserve">– STP не использует IP-адреса или транспортные протоколы.</w:t>
+      </w:r>
+    </w:p>
+    <w:p>
+      <w:pPr>
+        <w:pStyle w:val="FirstParagraph"/>
+      </w:pPr>
+      <w:r>
+        <w:rPr>
+          <w:b/>
+          <w:bCs/>
+        </w:rPr>
+        <w:t xml:space="preserve">Вывод:</w:t>
+      </w:r>
+      <w:r>
+        <w:t xml:space="preserve"> </w:t>
+      </w:r>
+      <w:r>
+        <w:t xml:space="preserve">STP – это</w:t>
+      </w:r>
+      <w:r>
+        <w:t xml:space="preserve"> </w:t>
+      </w:r>
+      <w:r>
+        <w:rPr>
+          <w:b/>
+          <w:bCs/>
+        </w:rPr>
+        <w:t xml:space="preserve">чисто канальный (L2) протокол</w:t>
+      </w:r>
+      <w:r>
+        <w:t xml:space="preserve">.</w:t>
+      </w:r>
+    </w:p>
+    <w:bookmarkEnd w:id="37"/>
+    <w:bookmarkEnd w:id="38"/>
+    <w:bookmarkStart w:id="45" w:name="разновидности-stp"/>
+    <w:p>
+      <w:pPr>
+        <w:pStyle w:val="Heading2"/>
+      </w:pPr>
+      <w:r>
+        <w:rPr>
+          <w:rStyle w:val="SectionNumber"/>
+        </w:rPr>
+        <w:t xml:space="preserve">3.5</w:t>
+      </w:r>
+      <w:r>
+        <w:tab/>
+      </w:r>
+      <w:r>
+        <w:t xml:space="preserve">Разновидности STP</w:t>
+      </w:r>
+    </w:p>
+    <w:p>
+      <w:pPr>
+        <w:numPr>
+          <w:ilvl w:val="0"/>
+          <w:numId w:val="1034"/>
+        </w:numPr>
+      </w:pPr>
+      <w:r>
+        <w:t xml:space="preserve">CST (Classic STP) — одно дерево для всей сети;</w:t>
+      </w:r>
+    </w:p>
+    <w:p>
+      <w:pPr>
+        <w:numPr>
+          <w:ilvl w:val="0"/>
+          <w:numId w:val="1034"/>
+        </w:numPr>
+      </w:pPr>
+      <w:r>
+        <w:t xml:space="preserve">PVST+ (Per-VLAN STP) — отдельное дерево для каждого VLAN (используется в Cisco);</w:t>
+      </w:r>
+    </w:p>
+    <w:p>
+      <w:pPr>
+        <w:numPr>
+          <w:ilvl w:val="0"/>
+          <w:numId w:val="1034"/>
+        </w:numPr>
+      </w:pPr>
+      <w:r>
+        <w:t xml:space="preserve">RSTP (Rapid STP) — ускоренная версия с временем сходимости 1-2 секунды;</w:t>
+      </w:r>
+    </w:p>
+    <w:p>
+      <w:pPr>
+        <w:numPr>
+          <w:ilvl w:val="0"/>
+          <w:numId w:val="1034"/>
+        </w:numPr>
+      </w:pPr>
+      <w:r>
+        <w:t xml:space="preserve">MSTP (Multiple STP) — объединение нескольких VLAN в одно дерево.</w:t>
+      </w:r>
+    </w:p>
+    <w:p>
+      <w:pPr>
+        <w:pStyle w:val="FirstParagraph"/>
+      </w:pPr>
+      <w:r>
+        <w:t xml:space="preserve">Чтобы подробно разобрать разновидности STP (Spanning Tree Protocol) и их отличия, рассмотрим каждый вариант с техническими особенностями, сферами применения и ключевыми различиями.</w:t>
+      </w:r>
+    </w:p>
+    <w:bookmarkStart w:id="39" w:name="cst-common-spanning-tree"/>
+    <w:p>
+      <w:pPr>
+        <w:pStyle w:val="Heading3"/>
+      </w:pPr>
+      <w:r>
+        <w:rPr>
+          <w:rStyle w:val="SectionNumber"/>
+        </w:rPr>
+        <w:t xml:space="preserve">3.5.1</w:t>
+      </w:r>
+      <w:r>
+        <w:tab/>
+      </w:r>
+      <w:r>
+        <w:t xml:space="preserve">1. CST (Common Spanning Tree)</w:t>
+      </w:r>
+    </w:p>
+    <w:p>
+      <w:pPr>
+        <w:numPr>
+          <w:ilvl w:val="0"/>
+          <w:numId w:val="1035"/>
+        </w:numPr>
+      </w:pPr>
+      <w:r>
+        <w:t xml:space="preserve">Описание:</w:t>
+      </w:r>
+    </w:p>
+    <w:p>
+      <w:pPr>
+        <w:numPr>
+          <w:ilvl w:val="1"/>
+          <w:numId w:val="1036"/>
+        </w:numPr>
+      </w:pPr>
+      <w:r>
+        <w:t xml:space="preserve">Один экземпляр STP для всей сети, независимо от количества VLAN.</w:t>
+      </w:r>
+    </w:p>
+    <w:p>
+      <w:pPr>
+        <w:numPr>
+          <w:ilvl w:val="1"/>
+          <w:numId w:val="1036"/>
+        </w:numPr>
+      </w:pPr>
+      <w:r>
+        <w:t xml:space="preserve">Все VLAN используют одно общее дерево (одна корневая коммутатор, одни блокируемые порты).</w:t>
+      </w:r>
+    </w:p>
+    <w:p>
+      <w:pPr>
+        <w:numPr>
+          <w:ilvl w:val="0"/>
+          <w:numId w:val="1035"/>
+        </w:numPr>
+      </w:pPr>
+      <w:r>
+        <w:t xml:space="preserve">Особенности:</w:t>
+      </w:r>
+    </w:p>
+    <w:p>
+      <w:pPr>
+        <w:numPr>
+          <w:ilvl w:val="1"/>
+          <w:numId w:val="1037"/>
+        </w:numPr>
+      </w:pPr>
+      <w:r>
+        <w:t xml:space="preserve">Простота настройки, но неэффективность в сетях с множеством VLAN.</w:t>
+      </w:r>
+    </w:p>
+    <w:p>
+      <w:pPr>
+        <w:numPr>
+          <w:ilvl w:val="1"/>
+          <w:numId w:val="1037"/>
+        </w:numPr>
+      </w:pPr>
+      <w:r>
+        <w:t xml:space="preserve">Если топология меняется, весь STP пересчитывается, что может вызвать задержки.</w:t>
+      </w:r>
+    </w:p>
+    <w:p>
+      <w:pPr>
+        <w:numPr>
+          <w:ilvl w:val="0"/>
+          <w:numId w:val="1035"/>
+        </w:numPr>
+      </w:pPr>
+      <w:r>
+        <w:rPr>
+          <w:b/>
+          <w:bCs/>
+        </w:rPr>
+        <w:t xml:space="preserve">Где применяется</w:t>
+      </w:r>
+      <w:r>
+        <w:t xml:space="preserve">:</w:t>
+      </w:r>
+    </w:p>
+    <w:p>
+      <w:pPr>
+        <w:pStyle w:val="Compact"/>
+        <w:numPr>
+          <w:ilvl w:val="1"/>
+          <w:numId w:val="1038"/>
+        </w:numPr>
+      </w:pPr>
+      <w:r>
+        <w:t xml:space="preserve">В устаревших сетях или оборудовании, не поддерживающем VLAN-зависимые версии STP.</w:t>
+      </w:r>
+    </w:p>
+    <w:bookmarkEnd w:id="39"/>
+    <w:bookmarkStart w:id="40" w:name="pvst-per-vlan-spanning-tree-plus"/>
+    <w:p>
+      <w:pPr>
+        <w:pStyle w:val="Heading3"/>
+      </w:pPr>
+      <w:r>
+        <w:rPr>
+          <w:rStyle w:val="SectionNumber"/>
+        </w:rPr>
+        <w:t xml:space="preserve">3.5.2</w:t>
+      </w:r>
+      <w:r>
+        <w:tab/>
+      </w:r>
+      <w:r>
+        <w:t xml:space="preserve">2. PVST+ (Per-VLAN Spanning Tree Plus)</w:t>
+      </w:r>
+    </w:p>
+    <w:p>
+      <w:pPr>
+        <w:numPr>
+          <w:ilvl w:val="0"/>
+          <w:numId w:val="1039"/>
+        </w:numPr>
+      </w:pPr>
+      <w:r>
+        <w:t xml:space="preserve">Описание:</w:t>
+      </w:r>
+    </w:p>
+    <w:p>
+      <w:pPr>
+        <w:numPr>
+          <w:ilvl w:val="1"/>
+          <w:numId w:val="1040"/>
+        </w:numPr>
+      </w:pPr>
+      <w:r>
+        <w:t xml:space="preserve">Каждый VLAN имеет собственное дерево STP.</w:t>
+      </w:r>
+    </w:p>
+    <w:p>
+      <w:pPr>
+        <w:numPr>
+          <w:ilvl w:val="1"/>
+          <w:numId w:val="1040"/>
+        </w:numPr>
+      </w:pPr>
+      <w:r>
+        <w:t xml:space="preserve">Развитие Cisco (проприетарный протокол), основанное на стандартном STP (IEEE 802.1D).</w:t>
+      </w:r>
+    </w:p>
+    <w:p>
+      <w:pPr>
+        <w:numPr>
+          <w:ilvl w:val="0"/>
+          <w:numId w:val="1039"/>
+        </w:numPr>
+      </w:pPr>
+      <w:r>
+        <w:t xml:space="preserve">Особенности:</w:t>
+      </w:r>
+    </w:p>
+    <w:p>
+      <w:pPr>
+        <w:numPr>
+          <w:ilvl w:val="1"/>
+          <w:numId w:val="1041"/>
+        </w:numPr>
+      </w:pPr>
+      <w:r>
+        <w:t xml:space="preserve">Позволяет балансировать нагрузку между VLAN (разные корневые коммутаторы для разных VLAN).</w:t>
+      </w:r>
+    </w:p>
+    <w:p>
+      <w:pPr>
+        <w:numPr>
+          <w:ilvl w:val="1"/>
+          <w:numId w:val="1041"/>
+        </w:numPr>
+      </w:pPr>
+      <w:r>
+        <w:t xml:space="preserve">Требует больше ресурсов CPU и памяти, так как для каждого VLAN строится отдельное дерево.</w:t>
+      </w:r>
+    </w:p>
+    <w:p>
+      <w:pPr>
+        <w:numPr>
+          <w:ilvl w:val="1"/>
+          <w:numId w:val="1041"/>
+        </w:numPr>
+      </w:pPr>
+      <w:r>
+        <w:t xml:space="preserve">Использует ISL (устаревший) или 802.1Q для передачи BPDU.</w:t>
+      </w:r>
+    </w:p>
+    <w:p>
+      <w:pPr>
+        <w:numPr>
+          <w:ilvl w:val="0"/>
+          <w:numId w:val="1039"/>
+        </w:numPr>
+      </w:pPr>
+      <w:r>
+        <w:rPr>
+          <w:b/>
+          <w:bCs/>
+        </w:rPr>
+        <w:t xml:space="preserve">Отличие от CST</w:t>
+      </w:r>
+      <w:r>
+        <w:t xml:space="preserve">:</w:t>
+      </w:r>
+    </w:p>
+    <w:p>
+      <w:pPr>
+        <w:pStyle w:val="Compact"/>
+        <w:numPr>
+          <w:ilvl w:val="1"/>
+          <w:numId w:val="1042"/>
+        </w:numPr>
+      </w:pPr>
+      <w:r>
+        <w:t xml:space="preserve">В CST — одно дерево на всю сеть, в PVST+ — отдельное дерево для каждого VLAN.</w:t>
+      </w:r>
+    </w:p>
+    <w:bookmarkEnd w:id="40"/>
+    <w:bookmarkStart w:id="41" w:name="X3d60e7c24f1ab1f574452c8f41b846555fe4a04"/>
+    <w:p>
+      <w:pPr>
+        <w:pStyle w:val="Heading3"/>
+      </w:pPr>
+      <w:r>
+        <w:rPr>
+          <w:rStyle w:val="SectionNumber"/>
+        </w:rPr>
+        <w:t xml:space="preserve">3.5.3</w:t>
+      </w:r>
+      <w:r>
+        <w:tab/>
+      </w:r>
+      <w:r>
+        <w:t xml:space="preserve">3. RSTP (Rapid Spanning Tree Protocol, IEEE 802.1w)</w:t>
+      </w:r>
+    </w:p>
+    <w:p>
+      <w:pPr>
+        <w:numPr>
+          <w:ilvl w:val="0"/>
+          <w:numId w:val="1043"/>
+        </w:numPr>
+      </w:pPr>
+      <w:r>
+        <w:t xml:space="preserve">Описание:</w:t>
+      </w:r>
+    </w:p>
+    <w:p>
+      <w:pPr>
+        <w:numPr>
+          <w:ilvl w:val="1"/>
+          <w:numId w:val="1044"/>
+        </w:numPr>
+      </w:pPr>
+      <w:r>
+        <w:t xml:space="preserve">Улучшенная версия STP с ускоренной сходимостью (1-2 секунды вместо 30-50 у STP).</w:t>
+      </w:r>
+    </w:p>
+    <w:p>
+      <w:pPr>
+        <w:numPr>
+          <w:ilvl w:val="1"/>
+          <w:numId w:val="1044"/>
+        </w:numPr>
+      </w:pPr>
+      <w:r>
+        <w:t xml:space="preserve">Обратная совместимость с STP (может работать в одном домене с классическим STP).</w:t>
+      </w:r>
+    </w:p>
+    <w:p>
+      <w:pPr>
+        <w:numPr>
+          <w:ilvl w:val="0"/>
+          <w:numId w:val="1043"/>
+        </w:numPr>
+      </w:pPr>
+      <w:r>
+        <w:t xml:space="preserve">Особенности:</w:t>
+      </w:r>
+    </w:p>
+    <w:p>
+      <w:pPr>
+        <w:numPr>
+          <w:ilvl w:val="1"/>
+          <w:numId w:val="1045"/>
+        </w:numPr>
+      </w:pPr>
+      <w:r>
+        <w:t xml:space="preserve">Вводит новые роли портов:</w:t>
+      </w:r>
+      <w:r>
+        <w:t xml:space="preserve"> </w:t>
+      </w:r>
+      <w:r>
+        <w:rPr>
+          <w:i/>
+          <w:iCs/>
+        </w:rPr>
+        <w:t xml:space="preserve">Alternate</w:t>
+      </w:r>
+      <w:r>
+        <w:t xml:space="preserve"> </w:t>
+      </w:r>
+      <w:r>
+        <w:t xml:space="preserve">(резервный) и</w:t>
+      </w:r>
+      <w:r>
+        <w:t xml:space="preserve"> </w:t>
+      </w:r>
+      <w:r>
+        <w:rPr>
+          <w:i/>
+          <w:iCs/>
+        </w:rPr>
+        <w:t xml:space="preserve">Backup</w:t>
+      </w:r>
+      <w:r>
+        <w:t xml:space="preserve"> </w:t>
+      </w:r>
+      <w:r>
+        <w:t xml:space="preserve">(дублирующий).</w:t>
+      </w:r>
+    </w:p>
+    <w:p>
+      <w:pPr>
+        <w:numPr>
+          <w:ilvl w:val="1"/>
+          <w:numId w:val="1045"/>
+        </w:numPr>
+      </w:pPr>
+      <w:r>
+        <w:t xml:space="preserve">Упрощённый процесс перехода в состояние Forwarding (нет состоятий Listening, Blocking заменено на Discarding).</w:t>
+      </w:r>
+    </w:p>
+    <w:p>
+      <w:pPr>
+        <w:numPr>
+          <w:ilvl w:val="1"/>
+          <w:numId w:val="1045"/>
+        </w:numPr>
+      </w:pPr>
+      <w:r>
+        <w:t xml:space="preserve">BPDU теперь обрабатываются как обычные данные (в STP — только корневой коммутатор генерирует BPDU).</w:t>
+      </w:r>
+    </w:p>
+    <w:p>
+      <w:pPr>
+        <w:numPr>
+          <w:ilvl w:val="0"/>
+          <w:numId w:val="1043"/>
+        </w:numPr>
+      </w:pPr>
+      <w:r>
+        <w:rPr>
+          <w:b/>
+          <w:bCs/>
+        </w:rPr>
+        <w:t xml:space="preserve">Отличие от CST/PVST+</w:t>
+      </w:r>
+      <w:r>
+        <w:t xml:space="preserve">:</w:t>
+      </w:r>
+    </w:p>
+    <w:p>
+      <w:pPr>
+        <w:numPr>
+          <w:ilvl w:val="1"/>
+          <w:numId w:val="1046"/>
+        </w:numPr>
+      </w:pPr>
+      <w:r>
+        <w:t xml:space="preserve">Быстрая реакция на изменения топологии.</w:t>
+      </w:r>
+    </w:p>
+    <w:p>
+      <w:pPr>
+        <w:numPr>
+          <w:ilvl w:val="1"/>
+          <w:numId w:val="1046"/>
+        </w:numPr>
+      </w:pPr>
+      <w:r>
+        <w:t xml:space="preserve">В RSTP нет отдельных деревьев для VLAN (если не используется RPVST+ от Cisco).</w:t>
+      </w:r>
+    </w:p>
+    <w:bookmarkEnd w:id="41"/>
+    <w:bookmarkStart w:id="42" w:name="Xfe1bea20870925910d12b6810eb5ead2e5b9d49"/>
+    <w:p>
+      <w:pPr>
+        <w:pStyle w:val="Heading3"/>
+      </w:pPr>
+      <w:r>
+        <w:rPr>
+          <w:rStyle w:val="SectionNumber"/>
+        </w:rPr>
+        <w:t xml:space="preserve">3.5.4</w:t>
+      </w:r>
+      <w:r>
+        <w:tab/>
+      </w:r>
+      <w:r>
+        <w:t xml:space="preserve">4. MSTP (Multiple Spanning Tree Protocol, IEEE 802.1s)</w:t>
+      </w:r>
+    </w:p>
+    <w:p>
+      <w:pPr>
+        <w:numPr>
+          <w:ilvl w:val="0"/>
+          <w:numId w:val="1047"/>
+        </w:numPr>
+      </w:pPr>
+      <w:r>
+        <w:t xml:space="preserve">Описание:</w:t>
+      </w:r>
+    </w:p>
+    <w:p>
+      <w:pPr>
+        <w:numPr>
+          <w:ilvl w:val="1"/>
+          <w:numId w:val="1048"/>
+        </w:numPr>
+      </w:pPr>
+      <w:r>
+        <w:t xml:space="preserve">Объединяет несколько VLAN в одну STP-инстанцию (MSTI — MST Instance).</w:t>
+      </w:r>
+    </w:p>
+    <w:p>
+      <w:pPr>
+        <w:numPr>
+          <w:ilvl w:val="1"/>
+          <w:numId w:val="1048"/>
+        </w:numPr>
+      </w:pPr>
+      <w:r>
+        <w:t xml:space="preserve">Позволяет балансировать нагрузку без создания отдельного дерева для каждого VLAN.</w:t>
+      </w:r>
+    </w:p>
+    <w:p>
+      <w:pPr>
+        <w:numPr>
+          <w:ilvl w:val="0"/>
+          <w:numId w:val="1047"/>
+        </w:numPr>
+      </w:pPr>
+      <w:r>
+        <w:t xml:space="preserve">Особенности:</w:t>
+      </w:r>
+    </w:p>
+    <w:p>
+      <w:pPr>
+        <w:numPr>
+          <w:ilvl w:val="1"/>
+          <w:numId w:val="1049"/>
+        </w:numPr>
+      </w:pPr>
+      <w:r>
+        <w:t xml:space="preserve">VLAN группируются в регионы (MST Region) с одинаковыми настройками.</w:t>
+      </w:r>
+    </w:p>
+    <w:p>
+      <w:pPr>
+        <w:numPr>
+          <w:ilvl w:val="1"/>
+          <w:numId w:val="1049"/>
+        </w:numPr>
+      </w:pPr>
+      <w:r>
+        <w:t xml:space="preserve">Экономит ресурсы коммутаторов (меньше BPDU, чем в PVST+).</w:t>
+      </w:r>
+    </w:p>
+    <w:p>
+      <w:pPr>
+        <w:numPr>
+          <w:ilvl w:val="1"/>
+          <w:numId w:val="1049"/>
+        </w:numPr>
+      </w:pPr>
+      <w:r>
+        <w:t xml:space="preserve">Совместим с RSTP (использует его механизмы сходимости).</w:t>
+      </w:r>
+    </w:p>
+    <w:p>
+      <w:pPr>
+        <w:numPr>
+          <w:ilvl w:val="0"/>
+          <w:numId w:val="1047"/>
+        </w:numPr>
+      </w:pPr>
+      <w:r>
+        <w:rPr>
+          <w:b/>
+          <w:bCs/>
+        </w:rPr>
+        <w:t xml:space="preserve">Отличие от PVST+/RSTP</w:t>
+      </w:r>
+      <w:r>
+        <w:t xml:space="preserve">:</w:t>
+      </w:r>
+    </w:p>
+    <w:p>
+      <w:pPr>
+        <w:numPr>
+          <w:ilvl w:val="1"/>
+          <w:numId w:val="1050"/>
+        </w:numPr>
+      </w:pPr>
+      <w:r>
+        <w:t xml:space="preserve">В PVST+ — отдельное дерево на VLAN, в MSTP — несколько VLAN в одном дереве.</w:t>
+      </w:r>
+    </w:p>
+    <w:p>
+      <w:pPr>
+        <w:numPr>
+          <w:ilvl w:val="1"/>
+          <w:numId w:val="1050"/>
+        </w:numPr>
+      </w:pPr>
+      <w:r>
+        <w:t xml:space="preserve">В RSTP — одно дерево для всех VLAN, в MSTP — гибкая группировка.</w:t>
+      </w:r>
+    </w:p>
+    <w:bookmarkEnd w:id="42"/>
+    <w:bookmarkStart w:id="44" w:name="сравнительная-таблица"/>
+    <w:p>
+      <w:pPr>
+        <w:pStyle w:val="Heading3"/>
+      </w:pPr>
+      <w:r>
+        <w:rPr>
+          <w:rStyle w:val="SectionNumber"/>
+        </w:rPr>
+        <w:t xml:space="preserve">3.5.5</w:t>
+      </w:r>
+      <w:r>
+        <w:tab/>
+      </w:r>
+      <w:r>
+        <w:t xml:space="preserve">Сравнительная таблица</w:t>
+      </w:r>
+    </w:p>
+    <w:bookmarkStart w:id="43" w:name="tbl:STP"/>
+    <w:p>
+      <w:pPr>
+        <w:pStyle w:val="TableCaption"/>
+      </w:pPr>
+      <w:r>
+        <w:t xml:space="preserve">Таблица 3: Разновидности STP</w:t>
+      </w:r>
+    </w:p>
+    <w:tbl>
+      <w:tblPr>
+        <w:tblStyle w:val="Table"/>
+        <w:tblW w:type="pct" w:w="5000"/>
+        <w:tblLayout w:type="fixed"/>
+        <w:tblLook w:firstRow="1" w:lastRow="0" w:firstColumn="0" w:lastColumn="0" w:noHBand="0" w:noVBand="0" w:val="0020"/>
+        <w:tblCaption w:val="Таблица 3: Разновидности STP"/>
+      </w:tblPr>
+      <w:tblGrid>
+        <w:gridCol w:w="2726"/>
+        <w:gridCol w:w="1168"/>
+        <w:gridCol w:w="1428"/>
+        <w:gridCol w:w="1298"/>
+        <w:gridCol w:w="1298"/>
+      </w:tblGrid>
+      <w:tr>
+        <w:trPr>
+          <w:tblHeader w:val="on"/>
+        </w:trPr>
+        <w:tc>
+          <w:tcPr/>
+          <w:p>
+            <w:pPr>
+              <w:pStyle w:val="Compact"/>
+            </w:pPr>
+            <w:r>
+              <w:rPr>
+                <w:b/>
+                <w:bCs/>
+              </w:rPr>
+              <w:t xml:space="preserve">Характеристика</w:t>
+            </w:r>
+          </w:p>
+        </w:tc>
+        <w:tc>
+          <w:tcPr/>
+          <w:p>
+            <w:pPr>
+              <w:pStyle w:val="Compact"/>
+            </w:pPr>
+            <w:r>
+              <w:rPr>
+                <w:b/>
+                <w:bCs/>
+              </w:rPr>
+              <w:t xml:space="preserve">CST</w:t>
+            </w:r>
+          </w:p>
+        </w:tc>
+        <w:tc>
+          <w:tcPr/>
+          <w:p>
+            <w:pPr>
+              <w:pStyle w:val="Compact"/>
+            </w:pPr>
+            <w:r>
+              <w:rPr>
+                <w:b/>
+                <w:bCs/>
+              </w:rPr>
+              <w:t xml:space="preserve">PVST+</w:t>
+            </w:r>
+          </w:p>
+        </w:tc>
+        <w:tc>
+          <w:tcPr/>
+          <w:p>
+            <w:pPr>
+              <w:pStyle w:val="Compact"/>
+            </w:pPr>
+            <w:r>
+              <w:rPr>
+                <w:b/>
+                <w:bCs/>
+              </w:rPr>
+              <w:t xml:space="preserve">RSTP</w:t>
+            </w:r>
+          </w:p>
+        </w:tc>
+        <w:tc>
+          <w:tcPr/>
+          <w:p>
+            <w:pPr>
+              <w:pStyle w:val="Compact"/>
+            </w:pPr>
+            <w:r>
+              <w:rPr>
+                <w:b/>
+                <w:bCs/>
+              </w:rPr>
+              <w:t xml:space="preserve">MSTP</w:t>
+            </w:r>
+          </w:p>
+        </w:tc>
+      </w:tr>
+      <w:tr>
+        <w:tc>
+          <w:tcPr/>
+          <w:p>
+            <w:pPr>
+              <w:pStyle w:val="Compact"/>
+            </w:pPr>
+            <w:r>
+              <w:rPr>
+                <w:b/>
+                <w:bCs/>
+              </w:rPr>
+              <w:t xml:space="preserve">Количество деревьев</w:t>
+            </w:r>
+          </w:p>
+        </w:tc>
+        <w:tc>
+          <w:tcPr/>
+          <w:p>
+            <w:pPr>
+              <w:pStyle w:val="Compact"/>
+            </w:pPr>
+            <w:r>
+              <w:t xml:space="preserve">Одно на всю сеть</w:t>
+            </w:r>
+          </w:p>
+        </w:tc>
+        <w:tc>
+          <w:tcPr/>
+          <w:p>
+            <w:pPr>
+              <w:pStyle w:val="Compact"/>
+            </w:pPr>
+            <w:r>
+              <w:t xml:space="preserve">Одно на VLAN</w:t>
+            </w:r>
+          </w:p>
+        </w:tc>
+        <w:tc>
+          <w:tcPr/>
+          <w:p>
+            <w:pPr>
+              <w:pStyle w:val="Compact"/>
+            </w:pPr>
+            <w:r>
+              <w:t xml:space="preserve">Одно (если не RPVST+)</w:t>
+            </w:r>
+          </w:p>
+        </w:tc>
+        <w:tc>
+          <w:tcPr/>
+          <w:p>
+            <w:pPr>
+              <w:pStyle w:val="Compact"/>
+            </w:pPr>
+            <w:r>
+              <w:t xml:space="preserve">Группы VLAN (MSTI)</w:t>
+            </w:r>
+          </w:p>
+        </w:tc>
+      </w:tr>
+      <w:tr>
+        <w:tc>
+          <w:tcPr/>
+          <w:p>
+            <w:pPr>
+              <w:pStyle w:val="Compact"/>
+            </w:pPr>
+            <w:r>
+              <w:rPr>
+                <w:b/>
+                <w:bCs/>
+              </w:rPr>
+              <w:t xml:space="preserve">Сходимость</w:t>
+            </w:r>
+          </w:p>
+        </w:tc>
+        <w:tc>
+          <w:tcPr/>
+          <w:p>
+            <w:pPr>
+              <w:pStyle w:val="Compact"/>
+            </w:pPr>
+            <w:r>
+              <w:t xml:space="preserve">Медленная (30-50 сек)</w:t>
+            </w:r>
+          </w:p>
+        </w:tc>
+        <w:tc>
+          <w:tcPr/>
+          <w:p>
+            <w:pPr>
+              <w:pStyle w:val="Compact"/>
+            </w:pPr>
+            <w:r>
+              <w:t xml:space="preserve">Медленная (как STP)</w:t>
+            </w:r>
+          </w:p>
+        </w:tc>
+        <w:tc>
+          <w:tcPr/>
+          <w:p>
+            <w:pPr>
+              <w:pStyle w:val="Compact"/>
+            </w:pPr>
+            <w:r>
+              <w:t xml:space="preserve">Быстрая (1-2 сек)</w:t>
+            </w:r>
+          </w:p>
+        </w:tc>
+        <w:tc>
+          <w:tcPr/>
+          <w:p>
+            <w:pPr>
+              <w:pStyle w:val="Compact"/>
+            </w:pPr>
+            <w:r>
+              <w:t xml:space="preserve">Быстрая (как RSTP)</w:t>
+            </w:r>
+          </w:p>
+        </w:tc>
+      </w:tr>
+      <w:tr>
+        <w:tc>
+          <w:tcPr/>
+          <w:p>
+            <w:pPr>
+              <w:pStyle w:val="Compact"/>
+            </w:pPr>
+            <w:r>
+              <w:rPr>
+                <w:b/>
+                <w:bCs/>
+              </w:rPr>
+              <w:t xml:space="preserve">Балансировка нагрузки</w:t>
+            </w:r>
+          </w:p>
+        </w:tc>
+        <w:tc>
+          <w:tcPr/>
+          <w:p>
+            <w:pPr>
+              <w:pStyle w:val="Compact"/>
+            </w:pPr>
+            <w:r>
+              <w:t xml:space="preserve">Нет</w:t>
+            </w:r>
+          </w:p>
+        </w:tc>
+        <w:tc>
+          <w:tcPr/>
+          <w:p>
+            <w:pPr>
+              <w:pStyle w:val="Compact"/>
+            </w:pPr>
+            <w:r>
+              <w:t xml:space="preserve">Да (разные корневые коммутаторы)</w:t>
+            </w:r>
+          </w:p>
+        </w:tc>
+        <w:tc>
+          <w:tcPr/>
+          <w:p>
+            <w:pPr>
+              <w:pStyle w:val="Compact"/>
+            </w:pPr>
+            <w:r>
+              <w:t xml:space="preserve">Нет (если не RPVST+)</w:t>
+            </w:r>
+          </w:p>
+        </w:tc>
+        <w:tc>
+          <w:tcPr/>
+          <w:p>
+            <w:pPr>
+              <w:pStyle w:val="Compact"/>
+            </w:pPr>
+            <w:r>
+              <w:t xml:space="preserve">Да (гибкая группировка)</w:t>
+            </w:r>
+          </w:p>
+        </w:tc>
+      </w:tr>
+      <w:tr>
+        <w:tc>
+          <w:tcPr/>
+          <w:p>
+            <w:pPr>
+              <w:pStyle w:val="Compact"/>
+            </w:pPr>
+            <w:r>
+              <w:rPr>
+                <w:b/>
+                <w:bCs/>
+              </w:rPr>
+              <w:t xml:space="preserve">Ресурсы</w:t>
+            </w:r>
+          </w:p>
+        </w:tc>
+        <w:tc>
+          <w:tcPr/>
+          <w:p>
+            <w:pPr>
+              <w:pStyle w:val="Compact"/>
+            </w:pPr>
+            <w:r>
+              <w:t xml:space="preserve">Минимальные</w:t>
+            </w:r>
+          </w:p>
+        </w:tc>
+        <w:tc>
+          <w:tcPr/>
+          <w:p>
+            <w:pPr>
+              <w:pStyle w:val="Compact"/>
+            </w:pPr>
+            <w:r>
+              <w:t xml:space="preserve">Высокие (много BPDU)</w:t>
+            </w:r>
+          </w:p>
+        </w:tc>
+        <w:tc>
+          <w:tcPr/>
+          <w:p>
+            <w:pPr>
+              <w:pStyle w:val="Compact"/>
+            </w:pPr>
+            <w:r>
+              <w:t xml:space="preserve">Умеренные</w:t>
+            </w:r>
+          </w:p>
+        </w:tc>
+        <w:tc>
+          <w:tcPr/>
+          <w:p>
+            <w:pPr>
+              <w:pStyle w:val="Compact"/>
+            </w:pPr>
+            <w:r>
+              <w:t xml:space="preserve">Оптимизированные</w:t>
+            </w:r>
+          </w:p>
+        </w:tc>
+      </w:tr>
+      <w:tr>
+        <w:tc>
+          <w:tcPr/>
+          <w:p>
+            <w:pPr>
+              <w:pStyle w:val="Compact"/>
+            </w:pPr>
+            <w:r>
+              <w:rPr>
+                <w:b/>
+                <w:bCs/>
+              </w:rPr>
+              <w:t xml:space="preserve">Стандарт</w:t>
+            </w:r>
+          </w:p>
+        </w:tc>
+        <w:tc>
+          <w:tcPr/>
+          <w:p>
+            <w:pPr>
+              <w:pStyle w:val="Compact"/>
+            </w:pPr>
+            <w:r>
+              <w:t xml:space="preserve">IEEE 802.1D</w:t>
+            </w:r>
+          </w:p>
+        </w:tc>
+        <w:tc>
+          <w:tcPr/>
+          <w:p>
+            <w:pPr>
+              <w:pStyle w:val="Compact"/>
+            </w:pPr>
+            <w:r>
+              <w:t xml:space="preserve">Cisco (на основе 802.1D)</w:t>
+            </w:r>
+          </w:p>
+        </w:tc>
+        <w:tc>
+          <w:tcPr/>
+          <w:p>
+            <w:pPr>
+              <w:pStyle w:val="Compact"/>
+            </w:pPr>
+            <w:r>
+              <w:t xml:space="preserve">IEEE 802.1w</w:t>
+            </w:r>
+          </w:p>
+        </w:tc>
+        <w:tc>
+          <w:tcPr/>
+          <w:p>
+            <w:pPr>
+              <w:pStyle w:val="Compact"/>
+            </w:pPr>
+            <w:r>
+              <w:t xml:space="preserve">IEEE 802.1s</w:t>
+            </w:r>
+          </w:p>
+        </w:tc>
+      </w:tr>
+    </w:tbl>
+    <w:bookmarkEnd w:id="43"/>
+    <w:bookmarkEnd w:id="44"/>
+    <w:bookmarkEnd w:id="45"/>
+    <w:bookmarkStart w:id="78" w:name="изучение-принципов-работы-stp"/>
+    <w:p>
+      <w:pPr>
+        <w:pStyle w:val="Heading2"/>
+      </w:pPr>
+      <w:r>
+        <w:rPr>
+          <w:rStyle w:val="SectionNumber"/>
+        </w:rPr>
+        <w:t xml:space="preserve">3.6</w:t>
+      </w:r>
+      <w:r>
+        <w:tab/>
+      </w:r>
+      <w:r>
+        <w:t xml:space="preserve">Изучение принципов работы STP</w:t>
+      </w:r>
+    </w:p>
+    <w:p>
+      <w:pPr>
+        <w:pStyle w:val="FirstParagraph"/>
+      </w:pPr>
+      <w:r>
+        <w:t xml:space="preserve">Рассмотрим простейший пример тоопологии сети, демонстрирующей работу STP</w:t>
+      </w:r>
+      <w:r>
+        <w:t xml:space="preserve"> </w:t>
+      </w:r>
+      <w:r>
+        <w:t xml:space="preserve">[4]</w:t>
+      </w:r>
+      <w:r>
+        <w:t xml:space="preserve"> </w:t>
+      </w:r>
+      <w:r>
+        <w:t xml:space="preserve">(рис. 3):</w:t>
+      </w:r>
+    </w:p>
+    <w:p>
+      <w:pPr>
+        <w:numPr>
+          <w:ilvl w:val="0"/>
+          <w:numId w:val="1051"/>
+        </w:numPr>
+      </w:pPr>
+      <w:r>
+        <w:t xml:space="preserve">Два коммутатора (Switch0 и Switch1) соединены двумя линками (избыточное соединение)</w:t>
+      </w:r>
+    </w:p>
+    <w:p>
+      <w:pPr>
+        <w:numPr>
+          <w:ilvl w:val="0"/>
+          <w:numId w:val="1051"/>
+        </w:numPr>
+      </w:pPr>
+      <w:r>
         <w:t xml:space="preserve">STP автоматически определяет топологию и блокирует один порт для предотвращения петель</w:t>
       </w:r>
     </w:p>
-    <w:bookmarkStart w:id="37" w:name="fig:003"/>
+    <w:bookmarkStart w:id="49" w:name="fig:003"/>
     <w:p>
       <w:pPr>
         <w:pStyle w:val="CaptionedFigure"/>
@@ -1783,18 +3808,18 @@
           <wp:inline>
             <wp:extent cx="4267200" cy="948266"/>
             <wp:effectExtent b="0" l="0" r="0" t="0"/>
-            <wp:docPr descr="Рис. 3: Топология сети" title="" id="35" name="Picture"/>
+            <wp:docPr descr="Рис. 3: Топология сети" title="" id="47" name="Picture"/>
             <a:graphic>
               <a:graphicData uri="http://schemas.openxmlformats.org/drawingml/2006/picture">
                 <pic:pic>
                   <pic:nvPicPr>
-                    <pic:cNvPr descr="image/3.png" id="36" name="Picture"/>
+                    <pic:cNvPr descr="image/3.png" id="48" name="Picture"/>
                     <pic:cNvPicPr>
                       <a:picLocks noChangeArrowheads="1" noChangeAspect="1"/>
                     </pic:cNvPicPr>
                   </pic:nvPicPr>
                   <pic:blipFill>
-                    <a:blip r:embed="rId34"/>
+                    <a:blip r:embed="rId46"/>
                     <a:stretch>
                       <a:fillRect/>
                     </a:stretch>
@@ -1829,7 +3854,7 @@
         <w:t xml:space="preserve">Рис. 3: Топология сети</w:t>
       </w:r>
     </w:p>
-    <w:bookmarkEnd w:id="37"/>
+    <w:bookmarkEnd w:id="49"/>
     <w:p>
       <w:pPr>
         <w:pStyle w:val="BodyText"/>
@@ -1838,7 +3863,7 @@
         <w:t xml:space="preserve">Зайдем на первый коммутатор и посмотрим настройки STP (рис. 4):</w:t>
       </w:r>
     </w:p>
-    <w:bookmarkStart w:id="41" w:name="fig:004"/>
+    <w:bookmarkStart w:id="53" w:name="fig:004"/>
     <w:p>
       <w:pPr>
         <w:pStyle w:val="CaptionedFigure"/>
@@ -1848,18 +3873,18 @@
           <wp:inline>
             <wp:extent cx="4267200" cy="2185820"/>
             <wp:effectExtent b="0" l="0" r="0" t="0"/>
-            <wp:docPr descr="Рис. 4: Настройки STP на sw-omabakumova-1" title="" id="39" name="Picture"/>
+            <wp:docPr descr="Рис. 4: Настройки STP на sw-omabakumova-1" title="" id="51" name="Picture"/>
             <a:graphic>
               <a:graphicData uri="http://schemas.openxmlformats.org/drawingml/2006/picture">
                 <pic:pic>
                   <pic:nvPicPr>
-                    <pic:cNvPr descr="image/4.png" id="40" name="Picture"/>
+                    <pic:cNvPr descr="image/4.png" id="52" name="Picture"/>
                     <pic:cNvPicPr>
                       <a:picLocks noChangeArrowheads="1" noChangeAspect="1"/>
                     </pic:cNvPicPr>
                   </pic:nvPicPr>
                   <pic:blipFill>
-                    <a:blip r:embed="rId38"/>
+                    <a:blip r:embed="rId50"/>
                     <a:stretch>
                       <a:fillRect/>
                     </a:stretch>
@@ -1894,7 +3919,7 @@
         <w:t xml:space="preserve">Рис. 4: Настройки STP на sw-omabakumova-1</w:t>
       </w:r>
     </w:p>
-    <w:bookmarkEnd w:id="41"/>
+    <w:bookmarkEnd w:id="53"/>
     <w:p>
       <w:pPr>
         <w:pStyle w:val="BodyText"/>
@@ -1911,7 +3936,7 @@
         <w:t xml:space="preserve">Аналогичным образом посмотрим нулевой коммутатор (рис. 5):</w:t>
       </w:r>
     </w:p>
-    <w:bookmarkStart w:id="45" w:name="fig:005"/>
+    <w:bookmarkStart w:id="57" w:name="fig:005"/>
     <w:p>
       <w:pPr>
         <w:pStyle w:val="CaptionedFigure"/>
@@ -1921,18 +3946,18 @@
           <wp:inline>
             <wp:extent cx="4267200" cy="2185820"/>
             <wp:effectExtent b="0" l="0" r="0" t="0"/>
-            <wp:docPr descr="Рис. 5: Настройки STP на sw-omabakumova-0" title="" id="43" name="Picture"/>
+            <wp:docPr descr="Рис. 5: Настройки STP на sw-omabakumova-0" title="" id="55" name="Picture"/>
             <a:graphic>
               <a:graphicData uri="http://schemas.openxmlformats.org/drawingml/2006/picture">
                 <pic:pic>
                   <pic:nvPicPr>
-                    <pic:cNvPr descr="image/5.png" id="44" name="Picture"/>
+                    <pic:cNvPr descr="image/5.png" id="56" name="Picture"/>
                     <pic:cNvPicPr>
                       <a:picLocks noChangeArrowheads="1" noChangeAspect="1"/>
                     </pic:cNvPicPr>
                   </pic:nvPicPr>
                   <pic:blipFill>
-                    <a:blip r:embed="rId42"/>
+                    <a:blip r:embed="rId54"/>
                     <a:stretch>
                       <a:fillRect/>
                     </a:stretch>
@@ -1967,7 +3992,7 @@
         <w:t xml:space="preserve">Рис. 5: Настройки STP на sw-omabakumova-0</w:t>
       </w:r>
     </w:p>
-    <w:bookmarkEnd w:id="45"/>
+    <w:bookmarkEnd w:id="57"/>
     <w:p>
       <w:pPr>
         <w:pStyle w:val="BodyText"/>
@@ -1984,7 +4009,7 @@
         <w:t xml:space="preserve">Далее рассмотрим ситуацию, когда интерфейс Fa0/2 перестает работать. Для наглядности отключим его вручную. Переходим в конфигурацию первого коммутатора (рис. 6):</w:t>
       </w:r>
     </w:p>
-    <w:bookmarkStart w:id="49" w:name="fig:006"/>
+    <w:bookmarkStart w:id="61" w:name="fig:006"/>
     <w:p>
       <w:pPr>
         <w:pStyle w:val="CaptionedFigure"/>
@@ -1994,207 +4019,12 @@
           <wp:inline>
             <wp:extent cx="4267200" cy="1218157"/>
             <wp:effectExtent b="0" l="0" r="0" t="0"/>
-            <wp:docPr descr="Рис. 6: Падение интерфейса" title="" id="47" name="Picture"/>
+            <wp:docPr descr="Рис. 6: Падение интерфейса" title="" id="59" name="Picture"/>
             <a:graphic>
               <a:graphicData uri="http://schemas.openxmlformats.org/drawingml/2006/picture">
                 <pic:pic>
                   <pic:nvPicPr>
-                    <pic:cNvPr descr="image/6.png" id="48" name="Picture"/>
-                    <pic:cNvPicPr>
-                      <a:picLocks noChangeArrowheads="1" noChangeAspect="1"/>
-                    </pic:cNvPicPr>
-                  </pic:nvPicPr>
-                  <pic:blipFill>
-                    <a:blip r:embed="rId46"/>
-                    <a:stretch>
-                      <a:fillRect/>
-                    </a:stretch>
-                  </pic:blipFill>
-                  <pic:spPr bwMode="auto">
-                    <a:xfrm>
-                      <a:off x="0" y="0"/>
-                      <a:ext cx="4267200" cy="1218157"/>
-                    </a:xfrm>
-                    <a:prstGeom prst="rect">
-                      <a:avLst/>
-                    </a:prstGeom>
-                    <a:noFill/>
-                    <a:ln w="9525">
-                      <a:noFill/>
-                      <a:headEnd/>
-                      <a:tailEnd/>
-                    </a:ln>
-                  </pic:spPr>
-                </pic:pic>
-              </a:graphicData>
-            </a:graphic>
-          </wp:inline>
-        </w:drawing>
-      </w:r>
-    </w:p>
-    <w:p>
-      <w:pPr>
-        <w:pStyle w:val="ImageCaption"/>
-      </w:pPr>
-      <w:r>
-        <w:t xml:space="preserve">Рис. 6: Падение интерфейса</w:t>
-      </w:r>
-    </w:p>
-    <w:bookmarkEnd w:id="49"/>
-    <w:p>
-      <w:pPr>
-        <w:pStyle w:val="BodyText"/>
-      </w:pPr>
-      <w:r>
-        <w:t xml:space="preserve">Отмечаем, что пропал линк (рис. 7):</w:t>
-      </w:r>
-    </w:p>
-    <w:bookmarkStart w:id="53" w:name="fig:007"/>
-    <w:p>
-      <w:pPr>
-        <w:pStyle w:val="CaptionedFigure"/>
-      </w:pPr>
-      <w:r>
-        <w:drawing>
-          <wp:inline>
-            <wp:extent cx="4267200" cy="786938"/>
-            <wp:effectExtent b="0" l="0" r="0" t="0"/>
-            <wp:docPr descr="Рис. 7: Отстутствие линка" title="" id="51" name="Picture"/>
-            <a:graphic>
-              <a:graphicData uri="http://schemas.openxmlformats.org/drawingml/2006/picture">
-                <pic:pic>
-                  <pic:nvPicPr>
-                    <pic:cNvPr descr="image/7.png" id="52" name="Picture"/>
-                    <pic:cNvPicPr>
-                      <a:picLocks noChangeArrowheads="1" noChangeAspect="1"/>
-                    </pic:cNvPicPr>
-                  </pic:nvPicPr>
-                  <pic:blipFill>
-                    <a:blip r:embed="rId50"/>
-                    <a:stretch>
-                      <a:fillRect/>
-                    </a:stretch>
-                  </pic:blipFill>
-                  <pic:spPr bwMode="auto">
-                    <a:xfrm>
-                      <a:off x="0" y="0"/>
-                      <a:ext cx="4267200" cy="786938"/>
-                    </a:xfrm>
-                    <a:prstGeom prst="rect">
-                      <a:avLst/>
-                    </a:prstGeom>
-                    <a:noFill/>
-                    <a:ln w="9525">
-                      <a:noFill/>
-                      <a:headEnd/>
-                      <a:tailEnd/>
-                    </a:ln>
-                  </pic:spPr>
-                </pic:pic>
-              </a:graphicData>
-            </a:graphic>
-          </wp:inline>
-        </w:drawing>
-      </w:r>
-    </w:p>
-    <w:p>
-      <w:pPr>
-        <w:pStyle w:val="ImageCaption"/>
-      </w:pPr>
-      <w:r>
-        <w:t xml:space="preserve">Рис. 7: Отстутствие линка</w:t>
-      </w:r>
-    </w:p>
-    <w:bookmarkEnd w:id="53"/>
-    <w:p>
-      <w:pPr>
-        <w:pStyle w:val="BodyText"/>
-      </w:pPr>
-      <w:r>
-        <w:t xml:space="preserve">Зайдем на нулевой коммутатор и посмотрим, что там произошло (рис. 8):</w:t>
-      </w:r>
-    </w:p>
-    <w:bookmarkStart w:id="57" w:name="fig:008"/>
-    <w:p>
-      <w:pPr>
-        <w:pStyle w:val="CaptionedFigure"/>
-      </w:pPr>
-      <w:r>
-        <w:drawing>
-          <wp:inline>
-            <wp:extent cx="4267200" cy="1218157"/>
-            <wp:effectExtent b="0" l="0" r="0" t="0"/>
-            <wp:docPr descr="Рис. 8: Порт обучается" title="" id="55" name="Picture"/>
-            <a:graphic>
-              <a:graphicData uri="http://schemas.openxmlformats.org/drawingml/2006/picture">
-                <pic:pic>
-                  <pic:nvPicPr>
-                    <pic:cNvPr descr="image/8.png" id="56" name="Picture"/>
-                    <pic:cNvPicPr>
-                      <a:picLocks noChangeArrowheads="1" noChangeAspect="1"/>
-                    </pic:cNvPicPr>
-                  </pic:nvPicPr>
-                  <pic:blipFill>
-                    <a:blip r:embed="rId54"/>
-                    <a:stretch>
-                      <a:fillRect/>
-                    </a:stretch>
-                  </pic:blipFill>
-                  <pic:spPr bwMode="auto">
-                    <a:xfrm>
-                      <a:off x="0" y="0"/>
-                      <a:ext cx="4267200" cy="1218157"/>
-                    </a:xfrm>
-                    <a:prstGeom prst="rect">
-                      <a:avLst/>
-                    </a:prstGeom>
-                    <a:noFill/>
-                    <a:ln w="9525">
-                      <a:noFill/>
-                      <a:headEnd/>
-                      <a:tailEnd/>
-                    </a:ln>
-                  </pic:spPr>
-                </pic:pic>
-              </a:graphicData>
-            </a:graphic>
-          </wp:inline>
-        </w:drawing>
-      </w:r>
-    </w:p>
-    <w:p>
-      <w:pPr>
-        <w:pStyle w:val="ImageCaption"/>
-      </w:pPr>
-      <w:r>
-        <w:t xml:space="preserve">Рис. 8: Порт обучается</w:t>
-      </w:r>
-    </w:p>
-    <w:bookmarkEnd w:id="57"/>
-    <w:p>
-      <w:pPr>
-        <w:pStyle w:val="BodyText"/>
-      </w:pPr>
-      <w:r>
-        <w:t xml:space="preserve">После отключения порта Fa0/2, порт Fa0/3 оказывается в состоянии обучения.Через 20 секунд(как и заявлено), порт перешел в состояние передачи и линк поднялся снова. (рис. 9):</w:t>
-      </w:r>
-    </w:p>
-    <w:bookmarkStart w:id="61" w:name="fig:009"/>
-    <w:p>
-      <w:pPr>
-        <w:pStyle w:val="CaptionedFigure"/>
-      </w:pPr>
-      <w:r>
-        <w:drawing>
-          <wp:inline>
-            <wp:extent cx="4267200" cy="1218157"/>
-            <wp:effectExtent b="0" l="0" r="0" t="0"/>
-            <wp:docPr descr="Рис. 9: В состоянии передачи" title="" id="59" name="Picture"/>
-            <a:graphic>
-              <a:graphicData uri="http://schemas.openxmlformats.org/drawingml/2006/picture">
-                <pic:pic>
-                  <pic:nvPicPr>
-                    <pic:cNvPr descr="image/9.png" id="60" name="Picture"/>
+                    <pic:cNvPr descr="image/6.png" id="60" name="Picture"/>
                     <pic:cNvPicPr>
                       <a:picLocks noChangeArrowheads="1" noChangeAspect="1"/>
                     </pic:cNvPicPr>
@@ -2232,7 +4062,7 @@
         <w:pStyle w:val="ImageCaption"/>
       </w:pPr>
       <w:r>
-        <w:t xml:space="preserve">Рис. 9: В состоянии передачи</w:t>
+        <w:t xml:space="preserve">Рис. 6: Падение интерфейса</w:t>
       </w:r>
     </w:p>
     <w:bookmarkEnd w:id="61"/>
@@ -2241,10 +4071,10 @@
         <w:pStyle w:val="BodyText"/>
       </w:pPr>
       <w:r>
-        <w:t xml:space="preserve">После поднятия порта Fa0/2, все вернулось к своему исходному виду (рис. 10):</w:t>
-      </w:r>
-    </w:p>
-    <w:bookmarkStart w:id="65" w:name="fig:010"/>
+        <w:t xml:space="preserve">Отмечаем, что пропал линк (рис. 7):</w:t>
+      </w:r>
+    </w:p>
+    <w:bookmarkStart w:id="65" w:name="fig:007"/>
     <w:p>
       <w:pPr>
         <w:pStyle w:val="CaptionedFigure"/>
@@ -2252,20 +4082,215 @@
       <w:r>
         <w:drawing>
           <wp:inline>
-            <wp:extent cx="4267200" cy="784772"/>
+            <wp:extent cx="4267200" cy="786938"/>
             <wp:effectExtent b="0" l="0" r="0" t="0"/>
-            <wp:docPr descr="Рис. 10: Все вернулось к тому, что было" title="" id="63" name="Picture"/>
+            <wp:docPr descr="Рис. 7: Отстутствие линка" title="" id="63" name="Picture"/>
             <a:graphic>
               <a:graphicData uri="http://schemas.openxmlformats.org/drawingml/2006/picture">
                 <pic:pic>
                   <pic:nvPicPr>
-                    <pic:cNvPr descr="image/10.png" id="64" name="Picture"/>
+                    <pic:cNvPr descr="image/7.png" id="64" name="Picture"/>
                     <pic:cNvPicPr>
                       <a:picLocks noChangeArrowheads="1" noChangeAspect="1"/>
                     </pic:cNvPicPr>
                   </pic:nvPicPr>
                   <pic:blipFill>
                     <a:blip r:embed="rId62"/>
+                    <a:stretch>
+                      <a:fillRect/>
+                    </a:stretch>
+                  </pic:blipFill>
+                  <pic:spPr bwMode="auto">
+                    <a:xfrm>
+                      <a:off x="0" y="0"/>
+                      <a:ext cx="4267200" cy="786938"/>
+                    </a:xfrm>
+                    <a:prstGeom prst="rect">
+                      <a:avLst/>
+                    </a:prstGeom>
+                    <a:noFill/>
+                    <a:ln w="9525">
+                      <a:noFill/>
+                      <a:headEnd/>
+                      <a:tailEnd/>
+                    </a:ln>
+                  </pic:spPr>
+                </pic:pic>
+              </a:graphicData>
+            </a:graphic>
+          </wp:inline>
+        </w:drawing>
+      </w:r>
+    </w:p>
+    <w:p>
+      <w:pPr>
+        <w:pStyle w:val="ImageCaption"/>
+      </w:pPr>
+      <w:r>
+        <w:t xml:space="preserve">Рис. 7: Отстутствие линка</w:t>
+      </w:r>
+    </w:p>
+    <w:bookmarkEnd w:id="65"/>
+    <w:p>
+      <w:pPr>
+        <w:pStyle w:val="BodyText"/>
+      </w:pPr>
+      <w:r>
+        <w:t xml:space="preserve">Зайдем на нулевой коммутатор и посмотрим, что там произошло (рис. 8):</w:t>
+      </w:r>
+    </w:p>
+    <w:bookmarkStart w:id="69" w:name="fig:008"/>
+    <w:p>
+      <w:pPr>
+        <w:pStyle w:val="CaptionedFigure"/>
+      </w:pPr>
+      <w:r>
+        <w:drawing>
+          <wp:inline>
+            <wp:extent cx="4267200" cy="1218157"/>
+            <wp:effectExtent b="0" l="0" r="0" t="0"/>
+            <wp:docPr descr="Рис. 8: Порт обучается" title="" id="67" name="Picture"/>
+            <a:graphic>
+              <a:graphicData uri="http://schemas.openxmlformats.org/drawingml/2006/picture">
+                <pic:pic>
+                  <pic:nvPicPr>
+                    <pic:cNvPr descr="image/8.png" id="68" name="Picture"/>
+                    <pic:cNvPicPr>
+                      <a:picLocks noChangeArrowheads="1" noChangeAspect="1"/>
+                    </pic:cNvPicPr>
+                  </pic:nvPicPr>
+                  <pic:blipFill>
+                    <a:blip r:embed="rId66"/>
+                    <a:stretch>
+                      <a:fillRect/>
+                    </a:stretch>
+                  </pic:blipFill>
+                  <pic:spPr bwMode="auto">
+                    <a:xfrm>
+                      <a:off x="0" y="0"/>
+                      <a:ext cx="4267200" cy="1218157"/>
+                    </a:xfrm>
+                    <a:prstGeom prst="rect">
+                      <a:avLst/>
+                    </a:prstGeom>
+                    <a:noFill/>
+                    <a:ln w="9525">
+                      <a:noFill/>
+                      <a:headEnd/>
+                      <a:tailEnd/>
+                    </a:ln>
+                  </pic:spPr>
+                </pic:pic>
+              </a:graphicData>
+            </a:graphic>
+          </wp:inline>
+        </w:drawing>
+      </w:r>
+    </w:p>
+    <w:p>
+      <w:pPr>
+        <w:pStyle w:val="ImageCaption"/>
+      </w:pPr>
+      <w:r>
+        <w:t xml:space="preserve">Рис. 8: Порт обучается</w:t>
+      </w:r>
+    </w:p>
+    <w:bookmarkEnd w:id="69"/>
+    <w:p>
+      <w:pPr>
+        <w:pStyle w:val="BodyText"/>
+      </w:pPr>
+      <w:r>
+        <w:t xml:space="preserve">После отключения порта Fa0/2, порт Fa0/3 оказывается в состоянии обучения.Через 20 секунд(как и заявлено), порт перешел в состояние передачи и линк поднялся снова. (рис. 9):</w:t>
+      </w:r>
+    </w:p>
+    <w:bookmarkStart w:id="73" w:name="fig:009"/>
+    <w:p>
+      <w:pPr>
+        <w:pStyle w:val="CaptionedFigure"/>
+      </w:pPr>
+      <w:r>
+        <w:drawing>
+          <wp:inline>
+            <wp:extent cx="4267200" cy="1218157"/>
+            <wp:effectExtent b="0" l="0" r="0" t="0"/>
+            <wp:docPr descr="Рис. 9: В состоянии передачи" title="" id="71" name="Picture"/>
+            <a:graphic>
+              <a:graphicData uri="http://schemas.openxmlformats.org/drawingml/2006/picture">
+                <pic:pic>
+                  <pic:nvPicPr>
+                    <pic:cNvPr descr="image/9.png" id="72" name="Picture"/>
+                    <pic:cNvPicPr>
+                      <a:picLocks noChangeArrowheads="1" noChangeAspect="1"/>
+                    </pic:cNvPicPr>
+                  </pic:nvPicPr>
+                  <pic:blipFill>
+                    <a:blip r:embed="rId70"/>
+                    <a:stretch>
+                      <a:fillRect/>
+                    </a:stretch>
+                  </pic:blipFill>
+                  <pic:spPr bwMode="auto">
+                    <a:xfrm>
+                      <a:off x="0" y="0"/>
+                      <a:ext cx="4267200" cy="1218157"/>
+                    </a:xfrm>
+                    <a:prstGeom prst="rect">
+                      <a:avLst/>
+                    </a:prstGeom>
+                    <a:noFill/>
+                    <a:ln w="9525">
+                      <a:noFill/>
+                      <a:headEnd/>
+                      <a:tailEnd/>
+                    </a:ln>
+                  </pic:spPr>
+                </pic:pic>
+              </a:graphicData>
+            </a:graphic>
+          </wp:inline>
+        </w:drawing>
+      </w:r>
+    </w:p>
+    <w:p>
+      <w:pPr>
+        <w:pStyle w:val="ImageCaption"/>
+      </w:pPr>
+      <w:r>
+        <w:t xml:space="preserve">Рис. 9: В состоянии передачи</w:t>
+      </w:r>
+    </w:p>
+    <w:bookmarkEnd w:id="73"/>
+    <w:p>
+      <w:pPr>
+        <w:pStyle w:val="BodyText"/>
+      </w:pPr>
+      <w:r>
+        <w:t xml:space="preserve">После поднятия порта Fa0/2, все вернулось к своему исходному виду (рис. 10):</w:t>
+      </w:r>
+    </w:p>
+    <w:bookmarkStart w:id="77" w:name="fig:010"/>
+    <w:p>
+      <w:pPr>
+        <w:pStyle w:val="CaptionedFigure"/>
+      </w:pPr>
+      <w:r>
+        <w:drawing>
+          <wp:inline>
+            <wp:extent cx="4267200" cy="784772"/>
+            <wp:effectExtent b="0" l="0" r="0" t="0"/>
+            <wp:docPr descr="Рис. 10: Все вернулось к тому, что было" title="" id="75" name="Picture"/>
+            <a:graphic>
+              <a:graphicData uri="http://schemas.openxmlformats.org/drawingml/2006/picture">
+                <pic:pic>
+                  <pic:nvPicPr>
+                    <pic:cNvPr descr="image/10.png" id="76" name="Picture"/>
+                    <pic:cNvPicPr>
+                      <a:picLocks noChangeArrowheads="1" noChangeAspect="1"/>
+                    </pic:cNvPicPr>
+                  </pic:nvPicPr>
+                  <pic:blipFill>
+                    <a:blip r:embed="rId74"/>
                     <a:stretch>
                       <a:fillRect/>
                     </a:stretch>
@@ -2300,9 +4325,9 @@
         <w:t xml:space="preserve">Рис. 10: Все вернулось к тому, что было</w:t>
       </w:r>
     </w:p>
-    <w:bookmarkEnd w:id="65"/>
-    <w:bookmarkEnd w:id="66"/>
-    <w:bookmarkStart w:id="79" w:name="настройка-rstp"/>
+    <w:bookmarkEnd w:id="77"/>
+    <w:bookmarkEnd w:id="78"/>
+    <w:bookmarkStart w:id="91" w:name="настройка-rstp"/>
     <w:p>
       <w:pPr>
         <w:pStyle w:val="Heading2"/>
@@ -2311,7 +4336,7 @@
         <w:rPr>
           <w:rStyle w:val="SectionNumber"/>
         </w:rPr>
-        <w:t xml:space="preserve">3.6</w:t>
+        <w:t xml:space="preserve">3.7</w:t>
       </w:r>
       <w:r>
         <w:tab/>
@@ -2345,7 +4370,7 @@
         <w:t xml:space="preserve">Также он достаточно просто и быстро включается (рис. 11):</w:t>
       </w:r>
     </w:p>
-    <w:bookmarkStart w:id="70" w:name="fig:011"/>
+    <w:bookmarkStart w:id="82" w:name="fig:011"/>
     <w:p>
       <w:pPr>
         <w:pStyle w:val="CaptionedFigure"/>
@@ -2355,18 +4380,18 @@
           <wp:inline>
             <wp:extent cx="4267200" cy="847527"/>
             <wp:effectExtent b="0" l="0" r="0" t="0"/>
-            <wp:docPr descr="Рис. 11: Включение RSTP на sq-omabakumova-1" title="" id="68" name="Picture"/>
+            <wp:docPr descr="Рис. 11: Включение RSTP на sq-omabakumova-1" title="" id="80" name="Picture"/>
             <a:graphic>
               <a:graphicData uri="http://schemas.openxmlformats.org/drawingml/2006/picture">
                 <pic:pic>
                   <pic:nvPicPr>
-                    <pic:cNvPr descr="image/11.png" id="69" name="Picture"/>
+                    <pic:cNvPr descr="image/11.png" id="81" name="Picture"/>
                     <pic:cNvPicPr>
                       <a:picLocks noChangeArrowheads="1" noChangeAspect="1"/>
                     </pic:cNvPicPr>
                   </pic:nvPicPr>
                   <pic:blipFill>
-                    <a:blip r:embed="rId67"/>
+                    <a:blip r:embed="rId79"/>
                     <a:stretch>
                       <a:fillRect/>
                     </a:stretch>
@@ -2401,7 +4426,7 @@
         <w:t xml:space="preserve">Рис. 11: Включение RSTP на sq-omabakumova-1</w:t>
       </w:r>
     </w:p>
-    <w:bookmarkEnd w:id="70"/>
+    <w:bookmarkEnd w:id="82"/>
     <w:p>
       <w:pPr>
         <w:pStyle w:val="BodyText"/>
@@ -2410,7 +4435,7 @@
         <w:t xml:space="preserve">Аналогичным образом включив на другом коммутаторе, проверим скорость обучения и вхждения в состояние передачи на нулевом коммутаторе (рис. 12):</w:t>
       </w:r>
     </w:p>
-    <w:bookmarkStart w:id="74" w:name="fig:012"/>
+    <w:bookmarkStart w:id="86" w:name="fig:012"/>
     <w:p>
       <w:pPr>
         <w:pStyle w:val="CaptionedFigure"/>
@@ -2420,18 +4445,18 @@
           <wp:inline>
             <wp:extent cx="5334000" cy="430096"/>
             <wp:effectExtent b="0" l="0" r="0" t="0"/>
-            <wp:docPr descr="Рис. 12: Отключение порта Fa0/2" title="" id="72" name="Picture"/>
+            <wp:docPr descr="Рис. 12: Отключение порта Fa0/2" title="" id="84" name="Picture"/>
             <a:graphic>
               <a:graphicData uri="http://schemas.openxmlformats.org/drawingml/2006/picture">
                 <pic:pic>
                   <pic:nvPicPr>
-                    <pic:cNvPr descr="image/12.png" id="73" name="Picture"/>
+                    <pic:cNvPr descr="image/12.png" id="85" name="Picture"/>
                     <pic:cNvPicPr>
                       <a:picLocks noChangeArrowheads="1" noChangeAspect="1"/>
                     </pic:cNvPicPr>
                   </pic:nvPicPr>
                   <pic:blipFill>
-                    <a:blip r:embed="rId71"/>
+                    <a:blip r:embed="rId83"/>
                     <a:stretch>
                       <a:fillRect/>
                     </a:stretch>
@@ -2466,8 +4491,8 @@
         <w:t xml:space="preserve">Рис. 12: Отключение порта Fa0/2</w:t>
       </w:r>
     </w:p>
-    <w:bookmarkEnd w:id="74"/>
-    <w:bookmarkStart w:id="78" w:name="fig:013"/>
+    <w:bookmarkEnd w:id="86"/>
+    <w:bookmarkStart w:id="90" w:name="fig:013"/>
     <w:p>
       <w:pPr>
         <w:pStyle w:val="CaptionedFigure"/>
@@ -2477,18 +4502,18 @@
           <wp:inline>
             <wp:extent cx="5334000" cy="551099"/>
             <wp:effectExtent b="0" l="0" r="0" t="0"/>
-            <wp:docPr descr="Рис. 13: Включение порта Fa0/2" title="" id="76" name="Picture"/>
+            <wp:docPr descr="Рис. 13: Включение порта Fa0/2" title="" id="88" name="Picture"/>
             <a:graphic>
               <a:graphicData uri="http://schemas.openxmlformats.org/drawingml/2006/picture">
                 <pic:pic>
                   <pic:nvPicPr>
-                    <pic:cNvPr descr="image/13.png" id="77" name="Picture"/>
+                    <pic:cNvPr descr="image/13.png" id="89" name="Picture"/>
                     <pic:cNvPicPr>
                       <a:picLocks noChangeArrowheads="1" noChangeAspect="1"/>
                     </pic:cNvPicPr>
                   </pic:nvPicPr>
                   <pic:blipFill>
-                    <a:blip r:embed="rId75"/>
+                    <a:blip r:embed="rId87"/>
                     <a:stretch>
                       <a:fillRect/>
                     </a:stretch>
@@ -2523,7 +4548,7 @@
         <w:t xml:space="preserve">Рис. 13: Включение порта Fa0/2</w:t>
       </w:r>
     </w:p>
-    <w:bookmarkEnd w:id="78"/>
+    <w:bookmarkEnd w:id="90"/>
     <w:p>
       <w:pPr>
         <w:pStyle w:val="BodyText"/>
@@ -2538,8 +4563,8 @@
         <w:t xml:space="preserve">RSTP гораздо быстрее классического STP.</w:t>
       </w:r>
     </w:p>
-    <w:bookmarkEnd w:id="79"/>
-    <w:bookmarkStart w:id="92" w:name="portfast"/>
+    <w:bookmarkEnd w:id="91"/>
+    <w:bookmarkStart w:id="104" w:name="portfast"/>
     <w:p>
       <w:pPr>
         <w:pStyle w:val="Heading2"/>
@@ -2548,7 +4573,7 @@
         <w:rPr>
           <w:rStyle w:val="SectionNumber"/>
         </w:rPr>
-        <w:t xml:space="preserve">3.7</w:t>
+        <w:t xml:space="preserve">3.8</w:t>
       </w:r>
       <w:r>
         <w:tab/>
@@ -2569,7 +4594,7 @@
       <w:pPr>
         <w:numPr>
           <w:ilvl w:val="0"/>
-          <w:numId w:val="1027"/>
+          <w:numId w:val="1052"/>
         </w:numPr>
       </w:pPr>
       <w:r>
@@ -2580,7 +4605,7 @@
       <w:pPr>
         <w:numPr>
           <w:ilvl w:val="0"/>
-          <w:numId w:val="1027"/>
+          <w:numId w:val="1052"/>
         </w:numPr>
       </w:pPr>
       <w:r>
@@ -2591,7 +4616,7 @@
       <w:pPr>
         <w:numPr>
           <w:ilvl w:val="0"/>
-          <w:numId w:val="1027"/>
+          <w:numId w:val="1052"/>
         </w:numPr>
       </w:pPr>
       <w:r>
@@ -2602,7 +4627,7 @@
       <w:pPr>
         <w:numPr>
           <w:ilvl w:val="0"/>
-          <w:numId w:val="1027"/>
+          <w:numId w:val="1052"/>
         </w:numPr>
       </w:pPr>
       <w:r>
@@ -2647,7 +4672,7 @@
         <w:pStyle w:val="Compact"/>
         <w:numPr>
           <w:ilvl w:val="0"/>
-          <w:numId w:val="1028"/>
+          <w:numId w:val="1053"/>
         </w:numPr>
       </w:pPr>
       <w:r>
@@ -2658,7 +4683,7 @@
       <w:pPr>
         <w:numPr>
           <w:ilvl w:val="0"/>
-          <w:numId w:val="1029"/>
+          <w:numId w:val="1054"/>
         </w:numPr>
       </w:pPr>
       <w:r>
@@ -2669,7 +4694,7 @@
       <w:pPr>
         <w:numPr>
           <w:ilvl w:val="0"/>
-          <w:numId w:val="1029"/>
+          <w:numId w:val="1054"/>
         </w:numPr>
       </w:pPr>
       <w:r>
@@ -2680,7 +4705,7 @@
       <w:pPr>
         <w:numPr>
           <w:ilvl w:val="0"/>
-          <w:numId w:val="1029"/>
+          <w:numId w:val="1054"/>
         </w:numPr>
       </w:pPr>
       <w:r>
@@ -2692,7 +4717,7 @@
         <w:pStyle w:val="Compact"/>
         <w:numPr>
           <w:ilvl w:val="0"/>
-          <w:numId w:val="1030"/>
+          <w:numId w:val="1055"/>
         </w:numPr>
       </w:pPr>
       <w:r>
@@ -2703,7 +4728,7 @@
       <w:pPr>
         <w:numPr>
           <w:ilvl w:val="0"/>
-          <w:numId w:val="1031"/>
+          <w:numId w:val="1056"/>
         </w:numPr>
       </w:pPr>
       <w:r>
@@ -2714,7 +4739,7 @@
       <w:pPr>
         <w:numPr>
           <w:ilvl w:val="0"/>
-          <w:numId w:val="1031"/>
+          <w:numId w:val="1056"/>
         </w:numPr>
       </w:pPr>
       <w:r>
@@ -2725,7 +4750,7 @@
       <w:pPr>
         <w:numPr>
           <w:ilvl w:val="0"/>
-          <w:numId w:val="1031"/>
+          <w:numId w:val="1056"/>
         </w:numPr>
       </w:pPr>
       <w:r>
@@ -2740,7 +4765,7 @@
         <w:t xml:space="preserve">Проведем настройку Portfast на нулевом коммутаторе, выбрав Fa0/4 в качестве интерфейса для настройки (рис. 14):</w:t>
       </w:r>
     </w:p>
-    <w:bookmarkStart w:id="83" w:name="fig:014"/>
+    <w:bookmarkStart w:id="95" w:name="fig:014"/>
     <w:p>
       <w:pPr>
         <w:pStyle w:val="CaptionedFigure"/>
@@ -2750,18 +4775,18 @@
           <wp:inline>
             <wp:extent cx="4267200" cy="2197480"/>
             <wp:effectExtent b="0" l="0" r="0" t="0"/>
-            <wp:docPr descr="Рис. 14: Настройка Portfast" title="" id="81" name="Picture"/>
+            <wp:docPr descr="Рис. 14: Настройка Portfast" title="" id="93" name="Picture"/>
             <a:graphic>
               <a:graphicData uri="http://schemas.openxmlformats.org/drawingml/2006/picture">
                 <pic:pic>
                   <pic:nvPicPr>
-                    <pic:cNvPr descr="image/14.png" id="82" name="Picture"/>
+                    <pic:cNvPr descr="image/14.png" id="94" name="Picture"/>
                     <pic:cNvPicPr>
                       <a:picLocks noChangeArrowheads="1" noChangeAspect="1"/>
                     </pic:cNvPicPr>
                   </pic:nvPicPr>
                   <pic:blipFill>
-                    <a:blip r:embed="rId80"/>
+                    <a:blip r:embed="rId92"/>
                     <a:stretch>
                       <a:fillRect/>
                     </a:stretch>
@@ -2796,7 +4821,7 @@
         <w:t xml:space="preserve">Рис. 14: Настройка Portfast</w:t>
       </w:r>
     </w:p>
-    <w:bookmarkEnd w:id="83"/>
+    <w:bookmarkEnd w:id="95"/>
     <w:p>
       <w:pPr>
         <w:pStyle w:val="BodyText"/>
@@ -2820,7 +4845,7 @@
         <w:t xml:space="preserve">(рис. 15):</w:t>
       </w:r>
     </w:p>
-    <w:bookmarkStart w:id="87" w:name="fig:015"/>
+    <w:bookmarkStart w:id="99" w:name="fig:015"/>
     <w:p>
       <w:pPr>
         <w:pStyle w:val="CaptionedFigure"/>
@@ -2830,18 +4855,18 @@
           <wp:inline>
             <wp:extent cx="4267200" cy="946967"/>
             <wp:effectExtent b="0" l="0" r="0" t="0"/>
-            <wp:docPr descr="Рис. 15: Результат настройки Portfast на Fa0/4" title="" id="85" name="Picture"/>
+            <wp:docPr descr="Рис. 15: Результат настройки Portfast на Fa0/4" title="" id="97" name="Picture"/>
             <a:graphic>
               <a:graphicData uri="http://schemas.openxmlformats.org/drawingml/2006/picture">
                 <pic:pic>
                   <pic:nvPicPr>
-                    <pic:cNvPr descr="image/15.png" id="86" name="Picture"/>
+                    <pic:cNvPr descr="image/15.png" id="98" name="Picture"/>
                     <pic:cNvPicPr>
                       <a:picLocks noChangeArrowheads="1" noChangeAspect="1"/>
                     </pic:cNvPicPr>
                   </pic:nvPicPr>
                   <pic:blipFill>
-                    <a:blip r:embed="rId84"/>
+                    <a:blip r:embed="rId96"/>
                     <a:stretch>
                       <a:fillRect/>
                     </a:stretch>
@@ -2876,7 +4901,7 @@
         <w:t xml:space="preserve">Рис. 15: Результат настройки Portfast на Fa0/4</w:t>
       </w:r>
     </w:p>
-    <w:bookmarkEnd w:id="87"/>
+    <w:bookmarkEnd w:id="99"/>
     <w:p>
       <w:pPr>
         <w:pStyle w:val="BodyText"/>
@@ -2891,7 +4916,7 @@
         <w:t xml:space="preserve">Теперь добавим еще одно оконечное устройство в рабочую область (рис. 16):</w:t>
       </w:r>
     </w:p>
-    <w:bookmarkStart w:id="91" w:name="fig:016"/>
+    <w:bookmarkStart w:id="103" w:name="fig:016"/>
     <w:p>
       <w:pPr>
         <w:pStyle w:val="CaptionedFigure"/>
@@ -2901,18 +4926,18 @@
           <wp:inline>
             <wp:extent cx="4267200" cy="1547745"/>
             <wp:effectExtent b="0" l="0" r="0" t="0"/>
-            <wp:docPr descr="Рис. 16: Быстрое подключение нового оконечного устройства" title="" id="89" name="Picture"/>
+            <wp:docPr descr="Рис. 16: Быстрое подключение нового оконечного устройства" title="" id="101" name="Picture"/>
             <a:graphic>
               <a:graphicData uri="http://schemas.openxmlformats.org/drawingml/2006/picture">
                 <pic:pic>
                   <pic:nvPicPr>
-                    <pic:cNvPr descr="image/16.png" id="90" name="Picture"/>
+                    <pic:cNvPr descr="image/16.png" id="102" name="Picture"/>
                     <pic:cNvPicPr>
                       <a:picLocks noChangeArrowheads="1" noChangeAspect="1"/>
                     </pic:cNvPicPr>
                   </pic:nvPicPr>
                   <pic:blipFill>
-                    <a:blip r:embed="rId88"/>
+                    <a:blip r:embed="rId100"/>
                     <a:stretch>
                       <a:fillRect/>
                     </a:stretch>
@@ -2947,7 +4972,7 @@
         <w:t xml:space="preserve">Рис. 16: Быстрое подключение нового оконечного устройства</w:t>
       </w:r>
     </w:p>
-    <w:bookmarkEnd w:id="91"/>
+    <w:bookmarkEnd w:id="103"/>
     <w:p>
       <w:pPr>
         <w:pStyle w:val="BodyText"/>
@@ -2962,9 +4987,9 @@
         <w:t xml:space="preserve">Если же к этому порту ошибочно подключить коммутатор, хаб или другое сетевое оборудование, может возникнуть кольцевая топология (broadcast-шторм), что приведет к нарушению работы сети. Поэтому необходимо использовать эту функцию осмотрительно и только там, где полностью контролируем подключения.</w:t>
       </w:r>
     </w:p>
-    <w:bookmarkEnd w:id="92"/>
-    <w:bookmarkEnd w:id="93"/>
-    <w:bookmarkStart w:id="174" w:name="агрегирование-каналов"/>
+    <w:bookmarkEnd w:id="104"/>
+    <w:bookmarkEnd w:id="105"/>
+    <w:bookmarkStart w:id="186" w:name="агрегирование-каналов"/>
     <w:p>
       <w:pPr>
         <w:pStyle w:val="Heading1"/>
@@ -3002,7 +5027,7 @@
       <w:pPr>
         <w:numPr>
           <w:ilvl w:val="0"/>
-          <w:numId w:val="1032"/>
+          <w:numId w:val="1057"/>
         </w:numPr>
       </w:pPr>
       <w:r>
@@ -3013,7 +5038,7 @@
       <w:pPr>
         <w:numPr>
           <w:ilvl w:val="0"/>
-          <w:numId w:val="1032"/>
+          <w:numId w:val="1057"/>
         </w:numPr>
       </w:pPr>
       <w:r>
@@ -3062,7 +5087,7 @@
         <w:pStyle w:val="Compact"/>
         <w:numPr>
           <w:ilvl w:val="0"/>
-          <w:numId w:val="1033"/>
+          <w:numId w:val="1058"/>
         </w:numPr>
       </w:pPr>
       <w:r>
@@ -3073,7 +5098,7 @@
       <w:pPr>
         <w:numPr>
           <w:ilvl w:val="0"/>
-          <w:numId w:val="1034"/>
+          <w:numId w:val="1059"/>
         </w:numPr>
       </w:pPr>
       <w:r>
@@ -3084,7 +5109,7 @@
       <w:pPr>
         <w:numPr>
           <w:ilvl w:val="0"/>
-          <w:numId w:val="1034"/>
+          <w:numId w:val="1059"/>
         </w:numPr>
       </w:pPr>
       <w:r>
@@ -3096,7 +5121,7 @@
         <w:pStyle w:val="Compact"/>
         <w:numPr>
           <w:ilvl w:val="1"/>
-          <w:numId w:val="1035"/>
+          <w:numId w:val="1060"/>
         </w:numPr>
       </w:pPr>
       <w:r>
@@ -3108,7 +5133,7 @@
         <w:pStyle w:val="Compact"/>
         <w:numPr>
           <w:ilvl w:val="0"/>
-          <w:numId w:val="1036"/>
+          <w:numId w:val="1061"/>
         </w:numPr>
       </w:pPr>
       <w:r>
@@ -3120,7 +5145,7 @@
         <w:pStyle w:val="Compact"/>
         <w:numPr>
           <w:ilvl w:val="0"/>
-          <w:numId w:val="1037"/>
+          <w:numId w:val="1062"/>
         </w:numPr>
       </w:pPr>
       <w:r>
@@ -3132,14 +5157,14 @@
         <w:pStyle w:val="Compact"/>
         <w:numPr>
           <w:ilvl w:val="0"/>
-          <w:numId w:val="1038"/>
+          <w:numId w:val="1063"/>
         </w:numPr>
       </w:pPr>
       <w:r>
         <w:t xml:space="preserve">Ручное агрегирование (on) – без протоколов, требует идентичных настроек портов.</w:t>
       </w:r>
     </w:p>
-    <w:bookmarkStart w:id="124" w:name="lacp"/>
+    <w:bookmarkStart w:id="136" w:name="lacp"/>
     <w:p>
       <w:pPr>
         <w:pStyle w:val="Heading2"/>
@@ -3206,7 +5231,7 @@
       <w:pPr>
         <w:numPr>
           <w:ilvl w:val="0"/>
-          <w:numId w:val="1039"/>
+          <w:numId w:val="1064"/>
         </w:numPr>
       </w:pPr>
       <w:r>
@@ -3227,7 +5252,7 @@
       <w:pPr>
         <w:numPr>
           <w:ilvl w:val="0"/>
-          <w:numId w:val="1039"/>
+          <w:numId w:val="1064"/>
         </w:numPr>
       </w:pPr>
       <w:r>
@@ -3252,13 +5277,13 @@
         <w:t xml:space="preserve">Чтобы агрегирование заработало, требуется следующая совместимость режимов.</w:t>
       </w:r>
     </w:p>
-    <w:bookmarkStart w:id="94" w:name="tbl:LACP"/>
+    <w:bookmarkStart w:id="106" w:name="tbl:LACP"/>
     <w:p>
       <w:pPr>
         <w:pStyle w:val="TableCaption"/>
       </w:pPr>
       <w:r>
-        <w:t xml:space="preserve">Таблица 1: Совместимость режимов LACP</w:t>
+        <w:t xml:space="preserve">Таблица 4: Совместимость режимов LACP</w:t>
       </w:r>
     </w:p>
     <w:tbl>
@@ -3266,7 +5291,7 @@
         <w:tblStyle w:val="Table"/>
         <w:tblW w:type="auto" w:w="0"/>
         <w:tblLook w:firstRow="1" w:lastRow="0" w:firstColumn="0" w:lastColumn="0" w:noHBand="0" w:noVBand="0" w:val="0020"/>
-        <w:tblCaption w:val="Таблица 1: Совместимость режимов LACP"/>
+        <w:tblCaption w:val="Таблица 4: Совместимость режимов LACP"/>
       </w:tblPr>
       <w:tblGrid>
         <w:gridCol w:w="2640"/>
@@ -3441,7 +5466,7 @@
         </w:tc>
       </w:tr>
     </w:tbl>
-    <w:bookmarkEnd w:id="94"/>
+    <w:bookmarkEnd w:id="106"/>
     <w:p>
       <w:pPr>
         <w:pStyle w:val="BodyText"/>
@@ -3476,7 +5501,7 @@
         <w:t xml:space="preserve">, агрегирование не активируется.</w:t>
       </w:r>
     </w:p>
-    <w:bookmarkStart w:id="123" w:name="настройка-lacp"/>
+    <w:bookmarkStart w:id="135" w:name="настройка-lacp"/>
     <w:p>
       <w:pPr>
         <w:pStyle w:val="Heading3"/>
@@ -3502,7 +5527,7 @@
         <w:t xml:space="preserve">Проведем агрегирование каналов на простейшем примере.Зайдем на нулевой коммутатор и проведем настройку с интерфейсами для начала там (рис. 17):</w:t>
       </w:r>
     </w:p>
-    <w:bookmarkStart w:id="98" w:name="fig:017"/>
+    <w:bookmarkStart w:id="110" w:name="fig:017"/>
     <w:p>
       <w:pPr>
         <w:pStyle w:val="CaptionedFigure"/>
@@ -3512,18 +5537,18 @@
           <wp:inline>
             <wp:extent cx="4267200" cy="3486951"/>
             <wp:effectExtent b="0" l="0" r="0" t="0"/>
-            <wp:docPr descr="Рис. 17: Настройка агрегирования каналов LACP на sw-omabakumova-0" title="" id="96" name="Picture"/>
+            <wp:docPr descr="Рис. 17: Настройка агрегирования каналов LACP на sw-omabakumova-0" title="" id="108" name="Picture"/>
             <a:graphic>
               <a:graphicData uri="http://schemas.openxmlformats.org/drawingml/2006/picture">
                 <pic:pic>
                   <pic:nvPicPr>
-                    <pic:cNvPr descr="image/17.png" id="97" name="Picture"/>
+                    <pic:cNvPr descr="image/17.png" id="109" name="Picture"/>
                     <pic:cNvPicPr>
                       <a:picLocks noChangeArrowheads="1" noChangeAspect="1"/>
                     </pic:cNvPicPr>
                   </pic:nvPicPr>
                   <pic:blipFill>
-                    <a:blip r:embed="rId95"/>
+                    <a:blip r:embed="rId107"/>
                     <a:stretch>
                       <a:fillRect/>
                     </a:stretch>
@@ -3558,8 +5583,8 @@
         <w:t xml:space="preserve">Рис. 17: Настройка агрегирования каналов LACP на sw-omabakumova-0</w:t>
       </w:r>
     </w:p>
-    <w:bookmarkEnd w:id="98"/>
-    <w:bookmarkStart w:id="102" w:name="fig:018"/>
+    <w:bookmarkEnd w:id="110"/>
+    <w:bookmarkStart w:id="114" w:name="fig:018"/>
     <w:p>
       <w:pPr>
         <w:pStyle w:val="CaptionedFigure"/>
@@ -3569,18 +5594,18 @@
           <wp:inline>
             <wp:extent cx="4064000" cy="2209800"/>
             <wp:effectExtent b="0" l="0" r="0" t="0"/>
-            <wp:docPr descr="Рис. 18: Проверка настройки агрегирования каналов LACP на sw-omabakumova-0" title="" id="100" name="Picture"/>
+            <wp:docPr descr="Рис. 18: Проверка настройки агрегирования каналов LACP на sw-omabakumova-0" title="" id="112" name="Picture"/>
             <a:graphic>
               <a:graphicData uri="http://schemas.openxmlformats.org/drawingml/2006/picture">
                 <pic:pic>
                   <pic:nvPicPr>
-                    <pic:cNvPr descr="image/18.png" id="101" name="Picture"/>
+                    <pic:cNvPr descr="image/18.png" id="113" name="Picture"/>
                     <pic:cNvPicPr>
                       <a:picLocks noChangeArrowheads="1" noChangeAspect="1"/>
                     </pic:cNvPicPr>
                   </pic:nvPicPr>
                   <pic:blipFill>
-                    <a:blip r:embed="rId99"/>
+                    <a:blip r:embed="rId111"/>
                     <a:stretch>
                       <a:fillRect/>
                     </a:stretch>
@@ -3615,7 +5640,7 @@
         <w:t xml:space="preserve">Рис. 18: Проверка настройки агрегирования каналов LACP на sw-omabakumova-0</w:t>
       </w:r>
     </w:p>
-    <w:bookmarkEnd w:id="102"/>
+    <w:bookmarkEnd w:id="114"/>
     <w:p>
       <w:pPr>
         <w:pStyle w:val="BodyText"/>
@@ -3624,7 +5649,7 @@
         <w:t xml:space="preserve">Зайдем на следующий коммутатор и проведем настройку (рис. 19):</w:t>
       </w:r>
     </w:p>
-    <w:bookmarkStart w:id="106" w:name="fig:019"/>
+    <w:bookmarkStart w:id="118" w:name="fig:019"/>
     <w:p>
       <w:pPr>
         <w:pStyle w:val="CaptionedFigure"/>
@@ -3634,18 +5659,18 @@
           <wp:inline>
             <wp:extent cx="4267200" cy="4392489"/>
             <wp:effectExtent b="0" l="0" r="0" t="0"/>
-            <wp:docPr descr="Рис. 19: Настройка агрегирования каналов LACP на sw-omabakumova-1" title="" id="104" name="Picture"/>
+            <wp:docPr descr="Рис. 19: Настройка агрегирования каналов LACP на sw-omabakumova-1" title="" id="116" name="Picture"/>
             <a:graphic>
               <a:graphicData uri="http://schemas.openxmlformats.org/drawingml/2006/picture">
                 <pic:pic>
                   <pic:nvPicPr>
-                    <pic:cNvPr descr="image/19.png" id="105" name="Picture"/>
+                    <pic:cNvPr descr="image/19.png" id="117" name="Picture"/>
                     <pic:cNvPicPr>
                       <a:picLocks noChangeArrowheads="1" noChangeAspect="1"/>
                     </pic:cNvPicPr>
                   </pic:nvPicPr>
                   <pic:blipFill>
-                    <a:blip r:embed="rId103"/>
+                    <a:blip r:embed="rId115"/>
                     <a:stretch>
                       <a:fillRect/>
                     </a:stretch>
@@ -3680,8 +5705,8 @@
         <w:t xml:space="preserve">Рис. 19: Настройка агрегирования каналов LACP на sw-omabakumova-1</w:t>
       </w:r>
     </w:p>
-    <w:bookmarkEnd w:id="106"/>
-    <w:bookmarkStart w:id="110" w:name="fig:020"/>
+    <w:bookmarkEnd w:id="118"/>
+    <w:bookmarkStart w:id="122" w:name="fig:020"/>
     <w:p>
       <w:pPr>
         <w:pStyle w:val="CaptionedFigure"/>
@@ -3691,18 +5716,18 @@
           <wp:inline>
             <wp:extent cx="4267200" cy="1506070"/>
             <wp:effectExtent b="0" l="0" r="0" t="0"/>
-            <wp:docPr descr="Рис. 20: Проверка настройки агрегирования каналов LACP на sw-omabakumova-1" title="" id="108" name="Picture"/>
+            <wp:docPr descr="Рис. 20: Проверка настройки агрегирования каналов LACP на sw-omabakumova-1" title="" id="120" name="Picture"/>
             <a:graphic>
               <a:graphicData uri="http://schemas.openxmlformats.org/drawingml/2006/picture">
                 <pic:pic>
                   <pic:nvPicPr>
-                    <pic:cNvPr descr="image/20.png" id="109" name="Picture"/>
+                    <pic:cNvPr descr="image/20.png" id="121" name="Picture"/>
                     <pic:cNvPicPr>
                       <a:picLocks noChangeArrowheads="1" noChangeAspect="1"/>
                     </pic:cNvPicPr>
                   </pic:nvPicPr>
                   <pic:blipFill>
-                    <a:blip r:embed="rId107"/>
+                    <a:blip r:embed="rId119"/>
                     <a:stretch>
                       <a:fillRect/>
                     </a:stretch>
@@ -3737,7 +5762,7 @@
         <w:t xml:space="preserve">Рис. 20: Проверка настройки агрегирования каналов LACP на sw-omabakumova-1</w:t>
       </w:r>
     </w:p>
-    <w:bookmarkEnd w:id="110"/>
+    <w:bookmarkEnd w:id="122"/>
     <w:p>
       <w:pPr>
         <w:pStyle w:val="BodyText"/>
@@ -3746,7 +5771,7 @@
         <w:t xml:space="preserve">Посмотрим на то, согласовался ли канал (рис. 21):</w:t>
       </w:r>
     </w:p>
-    <w:bookmarkStart w:id="114" w:name="fig:021"/>
+    <w:bookmarkStart w:id="126" w:name="fig:021"/>
     <w:p>
       <w:pPr>
         <w:pStyle w:val="CaptionedFigure"/>
@@ -3756,18 +5781,18 @@
           <wp:inline>
             <wp:extent cx="4267200" cy="2614411"/>
             <wp:effectExtent b="0" l="0" r="0" t="0"/>
-            <wp:docPr descr="Рис. 21: Вывод “show etherchannel summary”" title="" id="112" name="Picture"/>
+            <wp:docPr descr="Рис. 21: Вывод “show etherchannel summary”" title="" id="124" name="Picture"/>
             <a:graphic>
               <a:graphicData uri="http://schemas.openxmlformats.org/drawingml/2006/picture">
                 <pic:pic>
                   <pic:nvPicPr>
-                    <pic:cNvPr descr="image/21.png" id="113" name="Picture"/>
+                    <pic:cNvPr descr="image/21.png" id="125" name="Picture"/>
                     <pic:cNvPicPr>
                       <a:picLocks noChangeArrowheads="1" noChangeAspect="1"/>
                     </pic:cNvPicPr>
                   </pic:nvPicPr>
                   <pic:blipFill>
-                    <a:blip r:embed="rId111"/>
+                    <a:blip r:embed="rId123"/>
                     <a:stretch>
                       <a:fillRect/>
                     </a:stretch>
@@ -3808,7 +5833,7 @@
         <w:t xml:space="preserve">“show etherchannel summary”</w:t>
       </w:r>
     </w:p>
-    <w:bookmarkEnd w:id="114"/>
+    <w:bookmarkEnd w:id="126"/>
     <w:p>
       <w:pPr>
         <w:pStyle w:val="BodyText"/>
@@ -3823,7 +5848,7 @@
         <w:t xml:space="preserve">Проверим и на нулевом коммутаторе (рис. 22):</w:t>
       </w:r>
     </w:p>
-    <w:bookmarkStart w:id="118" w:name="fig:022"/>
+    <w:bookmarkStart w:id="130" w:name="fig:022"/>
     <w:p>
       <w:pPr>
         <w:pStyle w:val="CaptionedFigure"/>
@@ -3833,18 +5858,18 @@
           <wp:inline>
             <wp:extent cx="4267200" cy="4008267"/>
             <wp:effectExtent b="0" l="0" r="0" t="0"/>
-            <wp:docPr descr="Рис. 22: Вывод “show etherchannel port-channel”" title="" id="116" name="Picture"/>
+            <wp:docPr descr="Рис. 22: Вывод “show etherchannel port-channel”" title="" id="128" name="Picture"/>
             <a:graphic>
               <a:graphicData uri="http://schemas.openxmlformats.org/drawingml/2006/picture">
                 <pic:pic>
                   <pic:nvPicPr>
-                    <pic:cNvPr descr="image/22.png" id="117" name="Picture"/>
+                    <pic:cNvPr descr="image/22.png" id="129" name="Picture"/>
                     <pic:cNvPicPr>
                       <a:picLocks noChangeArrowheads="1" noChangeAspect="1"/>
                     </pic:cNvPicPr>
                   </pic:nvPicPr>
                   <pic:blipFill>
-                    <a:blip r:embed="rId115"/>
+                    <a:blip r:embed="rId127"/>
                     <a:stretch>
                       <a:fillRect/>
                     </a:stretch>
@@ -3885,7 +5910,7 @@
         <w:t xml:space="preserve">“show etherchannel port-channel”</w:t>
       </w:r>
     </w:p>
-    <w:bookmarkEnd w:id="118"/>
+    <w:bookmarkEnd w:id="130"/>
     <w:p>
       <w:pPr>
         <w:pStyle w:val="BodyText"/>
@@ -3919,7 +5944,7 @@
         <w:t xml:space="preserve">STP на них не срабатывает (рис. 23):</w:t>
       </w:r>
     </w:p>
-    <w:bookmarkStart w:id="122" w:name="fig:023"/>
+    <w:bookmarkStart w:id="134" w:name="fig:023"/>
     <w:p>
       <w:pPr>
         <w:pStyle w:val="CaptionedFigure"/>
@@ -3929,18 +5954,18 @@
           <wp:inline>
             <wp:extent cx="4267200" cy="812800"/>
             <wp:effectExtent b="0" l="0" r="0" t="0"/>
-            <wp:docPr descr="Рис. 23: Все линки активны" title="" id="120" name="Picture"/>
+            <wp:docPr descr="Рис. 23: Все линки активны" title="" id="132" name="Picture"/>
             <a:graphic>
               <a:graphicData uri="http://schemas.openxmlformats.org/drawingml/2006/picture">
                 <pic:pic>
                   <pic:nvPicPr>
-                    <pic:cNvPr descr="image/23.png" id="121" name="Picture"/>
+                    <pic:cNvPr descr="image/23.png" id="133" name="Picture"/>
                     <pic:cNvPicPr>
                       <a:picLocks noChangeArrowheads="1" noChangeAspect="1"/>
                     </pic:cNvPicPr>
                   </pic:nvPicPr>
                   <pic:blipFill>
-                    <a:blip r:embed="rId119"/>
+                    <a:blip r:embed="rId131"/>
                     <a:stretch>
                       <a:fillRect/>
                     </a:stretch>
@@ -3975,10 +6000,10 @@
         <w:t xml:space="preserve">Рис. 23: Все линки активны</w:t>
       </w:r>
     </w:p>
-    <w:bookmarkEnd w:id="122"/>
-    <w:bookmarkEnd w:id="123"/>
-    <w:bookmarkEnd w:id="124"/>
-    <w:bookmarkStart w:id="155" w:name="pagp"/>
+    <w:bookmarkEnd w:id="134"/>
+    <w:bookmarkEnd w:id="135"/>
+    <w:bookmarkEnd w:id="136"/>
+    <w:bookmarkStart w:id="167" w:name="pagp"/>
     <w:p>
       <w:pPr>
         <w:pStyle w:val="Heading2"/>
@@ -4042,7 +6067,7 @@
       <w:pPr>
         <w:numPr>
           <w:ilvl w:val="0"/>
-          <w:numId w:val="1040"/>
+          <w:numId w:val="1065"/>
         </w:numPr>
       </w:pPr>
       <w:r>
@@ -4063,7 +6088,7 @@
       <w:pPr>
         <w:numPr>
           <w:ilvl w:val="0"/>
-          <w:numId w:val="1040"/>
+          <w:numId w:val="1065"/>
         </w:numPr>
       </w:pPr>
       <w:r>
@@ -4080,13 +6105,13 @@
         <w:t xml:space="preserve">— работает пассивно и активирует PAgP только при получении соответствующих сообщений от соседнего устройства.</w:t>
       </w:r>
     </w:p>
-    <w:bookmarkStart w:id="125" w:name="tbl:PAgP"/>
+    <w:bookmarkStart w:id="137" w:name="tbl:PAgP"/>
     <w:p>
       <w:pPr>
         <w:pStyle w:val="TableCaption"/>
       </w:pPr>
       <w:r>
-        <w:t xml:space="preserve">Таблица 2: Совместимость режимов PAgP</w:t>
+        <w:t xml:space="preserve">Таблица 5: Совместимость режимов PAgP</w:t>
       </w:r>
     </w:p>
     <w:tbl>
@@ -4094,7 +6119,7 @@
         <w:tblStyle w:val="Table"/>
         <w:tblW w:type="auto" w:w="0"/>
         <w:tblLook w:firstRow="1" w:lastRow="0" w:firstColumn="0" w:lastColumn="0" w:noHBand="0" w:noVBand="0" w:val="0020"/>
-        <w:tblCaption w:val="Таблица 2: Совместимость режимов PAgP"/>
+        <w:tblCaption w:val="Таблица 5: Совместимость режимов PAgP"/>
       </w:tblPr>
       <w:tblGrid>
         <w:gridCol w:w="2640"/>
@@ -4269,8 +6294,8 @@
         </w:tc>
       </w:tr>
     </w:tbl>
-    <w:bookmarkEnd w:id="125"/>
-    <w:bookmarkStart w:id="154" w:name="настройка-pagp"/>
+    <w:bookmarkEnd w:id="137"/>
+    <w:bookmarkStart w:id="166" w:name="настройка-pagp"/>
     <w:p>
       <w:pPr>
         <w:pStyle w:val="Heading3"/>
@@ -4296,7 +6321,7 @@
         <w:t xml:space="preserve">Перейдем к реализации простейшего примера настройки PAgP.Зайдем на нулевой коммутатор и начнем настройку PAgP с него (рис. 24):</w:t>
       </w:r>
     </w:p>
-    <w:bookmarkStart w:id="129" w:name="fig:024"/>
+    <w:bookmarkStart w:id="141" w:name="fig:024"/>
     <w:p>
       <w:pPr>
         <w:pStyle w:val="CaptionedFigure"/>
@@ -4306,18 +6331,18 @@
           <wp:inline>
             <wp:extent cx="4267200" cy="2653369"/>
             <wp:effectExtent b="0" l="0" r="0" t="0"/>
-            <wp:docPr descr="Рис. 24: Настройка агрегирования каналов PAgP на sw-omabakumova-0" title="" id="127" name="Picture"/>
+            <wp:docPr descr="Рис. 24: Настройка агрегирования каналов PAgP на sw-omabakumova-0" title="" id="139" name="Picture"/>
             <a:graphic>
               <a:graphicData uri="http://schemas.openxmlformats.org/drawingml/2006/picture">
                 <pic:pic>
                   <pic:nvPicPr>
-                    <pic:cNvPr descr="image/24.png" id="128" name="Picture"/>
+                    <pic:cNvPr descr="image/24.png" id="140" name="Picture"/>
                     <pic:cNvPicPr>
                       <a:picLocks noChangeArrowheads="1" noChangeAspect="1"/>
                     </pic:cNvPicPr>
                   </pic:nvPicPr>
                   <pic:blipFill>
-                    <a:blip r:embed="rId126"/>
+                    <a:blip r:embed="rId138"/>
                     <a:stretch>
                       <a:fillRect/>
                     </a:stretch>
@@ -4352,8 +6377,8 @@
         <w:t xml:space="preserve">Рис. 24: Настройка агрегирования каналов PAgP на sw-omabakumova-0</w:t>
       </w:r>
     </w:p>
-    <w:bookmarkEnd w:id="129"/>
-    <w:bookmarkStart w:id="133" w:name="fig:025"/>
+    <w:bookmarkEnd w:id="141"/>
+    <w:bookmarkStart w:id="145" w:name="fig:025"/>
     <w:p>
       <w:pPr>
         <w:pStyle w:val="CaptionedFigure"/>
@@ -4363,18 +6388,18 @@
           <wp:inline>
             <wp:extent cx="3111500" cy="2273300"/>
             <wp:effectExtent b="0" l="0" r="0" t="0"/>
-            <wp:docPr descr="Рис. 25: Проверка настройки агрегирования каналов PAgP на sw-omabakumova-0" title="" id="131" name="Picture"/>
+            <wp:docPr descr="Рис. 25: Проверка настройки агрегирования каналов PAgP на sw-omabakumova-0" title="" id="143" name="Picture"/>
             <a:graphic>
               <a:graphicData uri="http://schemas.openxmlformats.org/drawingml/2006/picture">
                 <pic:pic>
                   <pic:nvPicPr>
-                    <pic:cNvPr descr="image/25.png" id="132" name="Picture"/>
+                    <pic:cNvPr descr="image/25.png" id="144" name="Picture"/>
                     <pic:cNvPicPr>
                       <a:picLocks noChangeArrowheads="1" noChangeAspect="1"/>
                     </pic:cNvPicPr>
                   </pic:nvPicPr>
                   <pic:blipFill>
-                    <a:blip r:embed="rId130"/>
+                    <a:blip r:embed="rId142"/>
                     <a:stretch>
                       <a:fillRect/>
                     </a:stretch>
@@ -4409,7 +6434,7 @@
         <w:t xml:space="preserve">Рис. 25: Проверка настройки агрегирования каналов PAgP на sw-omabakumova-0</w:t>
       </w:r>
     </w:p>
-    <w:bookmarkEnd w:id="133"/>
+    <w:bookmarkEnd w:id="145"/>
     <w:p>
       <w:pPr>
         <w:pStyle w:val="BodyText"/>
@@ -4418,7 +6443,7 @@
         <w:t xml:space="preserve">Перейдем ко первому коммутатору (рис. 26):</w:t>
       </w:r>
     </w:p>
-    <w:bookmarkStart w:id="137" w:name="fig:026"/>
+    <w:bookmarkStart w:id="149" w:name="fig:026"/>
     <w:p>
       <w:pPr>
         <w:pStyle w:val="CaptionedFigure"/>
@@ -4428,18 +6453,18 @@
           <wp:inline>
             <wp:extent cx="4267200" cy="2310977"/>
             <wp:effectExtent b="0" l="0" r="0" t="0"/>
-            <wp:docPr descr="Рис. 26: Настройка агрегирования каналов PAgP на sw-omabakumova-1" title="" id="135" name="Picture"/>
+            <wp:docPr descr="Рис. 26: Настройка агрегирования каналов PAgP на sw-omabakumova-1" title="" id="147" name="Picture"/>
             <a:graphic>
               <a:graphicData uri="http://schemas.openxmlformats.org/drawingml/2006/picture">
                 <pic:pic>
                   <pic:nvPicPr>
-                    <pic:cNvPr descr="image/26.png" id="136" name="Picture"/>
+                    <pic:cNvPr descr="image/26.png" id="148" name="Picture"/>
                     <pic:cNvPicPr>
                       <a:picLocks noChangeArrowheads="1" noChangeAspect="1"/>
                     </pic:cNvPicPr>
                   </pic:nvPicPr>
                   <pic:blipFill>
-                    <a:blip r:embed="rId134"/>
+                    <a:blip r:embed="rId146"/>
                     <a:stretch>
                       <a:fillRect/>
                     </a:stretch>
@@ -4474,8 +6499,8 @@
         <w:t xml:space="preserve">Рис. 26: Настройка агрегирования каналов PAgP на sw-omabakumova-1</w:t>
       </w:r>
     </w:p>
-    <w:bookmarkEnd w:id="137"/>
-    <w:bookmarkStart w:id="141" w:name="fig:027"/>
+    <w:bookmarkEnd w:id="149"/>
+    <w:bookmarkStart w:id="153" w:name="fig:027"/>
     <w:p>
       <w:pPr>
         <w:pStyle w:val="CaptionedFigure"/>
@@ -4485,18 +6510,18 @@
           <wp:inline>
             <wp:extent cx="3568700" cy="1892300"/>
             <wp:effectExtent b="0" l="0" r="0" t="0"/>
-            <wp:docPr descr="Рис. 27: Проверка настройки агрегирования каналов PAgP на sw-omabakumova-1" title="" id="139" name="Picture"/>
+            <wp:docPr descr="Рис. 27: Проверка настройки агрегирования каналов PAgP на sw-omabakumova-1" title="" id="151" name="Picture"/>
             <a:graphic>
               <a:graphicData uri="http://schemas.openxmlformats.org/drawingml/2006/picture">
                 <pic:pic>
                   <pic:nvPicPr>
-                    <pic:cNvPr descr="image/27.png" id="140" name="Picture"/>
+                    <pic:cNvPr descr="image/27.png" id="152" name="Picture"/>
                     <pic:cNvPicPr>
                       <a:picLocks noChangeArrowheads="1" noChangeAspect="1"/>
                     </pic:cNvPicPr>
                   </pic:nvPicPr>
                   <pic:blipFill>
-                    <a:blip r:embed="rId138"/>
+                    <a:blip r:embed="rId150"/>
                     <a:stretch>
                       <a:fillRect/>
                     </a:stretch>
@@ -4531,7 +6556,7 @@
         <w:t xml:space="preserve">Рис. 27: Проверка настройки агрегирования каналов PAgP на sw-omabakumova-1</w:t>
       </w:r>
     </w:p>
-    <w:bookmarkEnd w:id="141"/>
+    <w:bookmarkEnd w:id="153"/>
     <w:p>
       <w:pPr>
         <w:pStyle w:val="BodyText"/>
@@ -4540,7 +6565,7 @@
         <w:t xml:space="preserve">Помним о выключенных интерфейсах на коммутаторе, поэтому возвращаемся на нулевой и включаем их (рис. 28):</w:t>
       </w:r>
     </w:p>
-    <w:bookmarkStart w:id="145" w:name="fig:028"/>
+    <w:bookmarkStart w:id="157" w:name="fig:028"/>
     <w:p>
       <w:pPr>
         <w:pStyle w:val="CaptionedFigure"/>
@@ -4550,18 +6575,18 @@
           <wp:inline>
             <wp:extent cx="4267200" cy="1904999"/>
             <wp:effectExtent b="0" l="0" r="0" t="0"/>
-            <wp:docPr descr="Рис. 28: Включение интерфейсов на sw-omabakumova-0" title="" id="143" name="Picture"/>
+            <wp:docPr descr="Рис. 28: Включение интерфейсов на sw-omabakumova-0" title="" id="155" name="Picture"/>
             <a:graphic>
               <a:graphicData uri="http://schemas.openxmlformats.org/drawingml/2006/picture">
                 <pic:pic>
                   <pic:nvPicPr>
-                    <pic:cNvPr descr="image/28.png" id="144" name="Picture"/>
+                    <pic:cNvPr descr="image/28.png" id="156" name="Picture"/>
                     <pic:cNvPicPr>
                       <a:picLocks noChangeArrowheads="1" noChangeAspect="1"/>
                     </pic:cNvPicPr>
                   </pic:nvPicPr>
                   <pic:blipFill>
-                    <a:blip r:embed="rId142"/>
+                    <a:blip r:embed="rId154"/>
                     <a:stretch>
                       <a:fillRect/>
                     </a:stretch>
@@ -4596,7 +6621,7 @@
         <w:t xml:space="preserve">Рис. 28: Включение интерфейсов на sw-omabakumova-0</w:t>
       </w:r>
     </w:p>
-    <w:bookmarkEnd w:id="145"/>
+    <w:bookmarkEnd w:id="157"/>
     <w:p>
       <w:pPr>
         <w:pStyle w:val="BodyText"/>
@@ -4605,7 +6630,7 @@
         <w:t xml:space="preserve">Все поднято, теперь посмотрим в целом результаты настройки на обоих коммутаторах (рис. 29):</w:t>
       </w:r>
     </w:p>
-    <w:bookmarkStart w:id="149" w:name="fig:029"/>
+    <w:bookmarkStart w:id="161" w:name="fig:029"/>
     <w:p>
       <w:pPr>
         <w:pStyle w:val="CaptionedFigure"/>
@@ -4615,18 +6640,18 @@
           <wp:inline>
             <wp:extent cx="4267200" cy="2612777"/>
             <wp:effectExtent b="0" l="0" r="0" t="0"/>
-            <wp:docPr descr="Рис. 29: Вывод “show etherchannel summary” на sw-omabakumova-0" title="" id="147" name="Picture"/>
+            <wp:docPr descr="Рис. 29: Вывод “show etherchannel summary” на sw-omabakumova-0" title="" id="159" name="Picture"/>
             <a:graphic>
               <a:graphicData uri="http://schemas.openxmlformats.org/drawingml/2006/picture">
                 <pic:pic>
                   <pic:nvPicPr>
-                    <pic:cNvPr descr="image/29.png" id="148" name="Picture"/>
+                    <pic:cNvPr descr="image/29.png" id="160" name="Picture"/>
                     <pic:cNvPicPr>
                       <a:picLocks noChangeArrowheads="1" noChangeAspect="1"/>
                     </pic:cNvPicPr>
                   </pic:nvPicPr>
                   <pic:blipFill>
-                    <a:blip r:embed="rId146"/>
+                    <a:blip r:embed="rId158"/>
                     <a:stretch>
                       <a:fillRect/>
                     </a:stretch>
@@ -4673,8 +6698,8 @@
         <w:t xml:space="preserve">на sw-omabakumova-0</w:t>
       </w:r>
     </w:p>
-    <w:bookmarkEnd w:id="149"/>
-    <w:bookmarkStart w:id="153" w:name="fig:030"/>
+    <w:bookmarkEnd w:id="161"/>
+    <w:bookmarkStart w:id="165" w:name="fig:030"/>
     <w:p>
       <w:pPr>
         <w:pStyle w:val="CaptionedFigure"/>
@@ -4684,18 +6709,18 @@
           <wp:inline>
             <wp:extent cx="4267200" cy="2612777"/>
             <wp:effectExtent b="0" l="0" r="0" t="0"/>
-            <wp:docPr descr="Рис. 30: Вывод “show etherchannel summary” на sw-omabakumova-1" title="" id="151" name="Picture"/>
+            <wp:docPr descr="Рис. 30: Вывод “show etherchannel summary” на sw-omabakumova-1" title="" id="163" name="Picture"/>
             <a:graphic>
               <a:graphicData uri="http://schemas.openxmlformats.org/drawingml/2006/picture">
                 <pic:pic>
                   <pic:nvPicPr>
-                    <pic:cNvPr descr="image/30.png" id="152" name="Picture"/>
+                    <pic:cNvPr descr="image/30.png" id="164" name="Picture"/>
                     <pic:cNvPicPr>
                       <a:picLocks noChangeArrowheads="1" noChangeAspect="1"/>
                     </pic:cNvPicPr>
                   </pic:nvPicPr>
                   <pic:blipFill>
-                    <a:blip r:embed="rId150"/>
+                    <a:blip r:embed="rId162"/>
                     <a:stretch>
                       <a:fillRect/>
                     </a:stretch>
@@ -4742,10 +6767,10 @@
         <w:t xml:space="preserve">на sw-omabakumova-1</w:t>
       </w:r>
     </w:p>
-    <w:bookmarkEnd w:id="153"/>
-    <w:bookmarkEnd w:id="154"/>
-    <w:bookmarkEnd w:id="155"/>
-    <w:bookmarkStart w:id="173" w:name="ручное-агрегирование"/>
+    <w:bookmarkEnd w:id="165"/>
+    <w:bookmarkEnd w:id="166"/>
+    <w:bookmarkEnd w:id="167"/>
+    <w:bookmarkStart w:id="185" w:name="ручное-агрегирование"/>
     <w:p>
       <w:pPr>
         <w:pStyle w:val="Heading2"/>
@@ -4799,7 +6824,7 @@
       <w:pPr>
         <w:numPr>
           <w:ilvl w:val="0"/>
-          <w:numId w:val="1041"/>
+          <w:numId w:val="1066"/>
         </w:numPr>
       </w:pPr>
       <w:r>
@@ -4820,7 +6845,7 @@
       <w:pPr>
         <w:numPr>
           <w:ilvl w:val="0"/>
-          <w:numId w:val="1041"/>
+          <w:numId w:val="1066"/>
         </w:numPr>
       </w:pPr>
       <w:r>
@@ -4841,7 +6866,7 @@
       <w:pPr>
         <w:numPr>
           <w:ilvl w:val="0"/>
-          <w:numId w:val="1041"/>
+          <w:numId w:val="1066"/>
         </w:numPr>
       </w:pPr>
       <w:r>
@@ -4987,7 +7012,7 @@
         </w:tc>
       </w:tr>
     </w:tbl>
-    <w:bookmarkStart w:id="172" w:name="настройка-ручного-агрегирования"/>
+    <w:bookmarkStart w:id="184" w:name="настройка-ручного-агрегирования"/>
     <w:p>
       <w:pPr>
         <w:pStyle w:val="Heading3"/>
@@ -5022,7 +7047,7 @@
         <w:t xml:space="preserve">.Аналогично заходим на нулевой коммутатор для начала (рис. 31):</w:t>
       </w:r>
     </w:p>
-    <w:bookmarkStart w:id="159" w:name="fig:031"/>
+    <w:bookmarkStart w:id="171" w:name="fig:031"/>
     <w:p>
       <w:pPr>
         <w:pStyle w:val="CaptionedFigure"/>
@@ -5032,18 +7057,18 @@
           <wp:inline>
             <wp:extent cx="4267200" cy="4245575"/>
             <wp:effectExtent b="0" l="0" r="0" t="0"/>
-            <wp:docPr descr="Рис. 31: Настройка ручного агрегирования каналов на sw-omabakumova-0" title="" id="157" name="Picture"/>
+            <wp:docPr descr="Рис. 31: Настройка ручного агрегирования каналов на sw-omabakumova-0" title="" id="169" name="Picture"/>
             <a:graphic>
               <a:graphicData uri="http://schemas.openxmlformats.org/drawingml/2006/picture">
                 <pic:pic>
                   <pic:nvPicPr>
-                    <pic:cNvPr descr="image/31.png" id="158" name="Picture"/>
+                    <pic:cNvPr descr="image/31.png" id="170" name="Picture"/>
                     <pic:cNvPicPr>
                       <a:picLocks noChangeArrowheads="1" noChangeAspect="1"/>
                     </pic:cNvPicPr>
                   </pic:nvPicPr>
                   <pic:blipFill>
-                    <a:blip r:embed="rId156"/>
+                    <a:blip r:embed="rId168"/>
                     <a:stretch>
                       <a:fillRect/>
                     </a:stretch>
@@ -5078,8 +7103,8 @@
         <w:t xml:space="preserve">Рис. 31: Настройка ручного агрегирования каналов на sw-omabakumova-0</w:t>
       </w:r>
     </w:p>
-    <w:bookmarkEnd w:id="159"/>
-    <w:bookmarkStart w:id="163" w:name="fig:032"/>
+    <w:bookmarkEnd w:id="171"/>
+    <w:bookmarkStart w:id="175" w:name="fig:032"/>
     <w:p>
       <w:pPr>
         <w:pStyle w:val="CaptionedFigure"/>
@@ -5089,18 +7114,18 @@
           <wp:inline>
             <wp:extent cx="2616200" cy="1841500"/>
             <wp:effectExtent b="0" l="0" r="0" t="0"/>
-            <wp:docPr descr="Рис. 32: Проверка настройки ручного агрегирования каналов на sw-omabakumova-0" title="" id="161" name="Picture"/>
+            <wp:docPr descr="Рис. 32: Проверка настройки ручного агрегирования каналов на sw-omabakumova-0" title="" id="173" name="Picture"/>
             <a:graphic>
               <a:graphicData uri="http://schemas.openxmlformats.org/drawingml/2006/picture">
                 <pic:pic>
                   <pic:nvPicPr>
-                    <pic:cNvPr descr="image/32.png" id="162" name="Picture"/>
+                    <pic:cNvPr descr="image/32.png" id="174" name="Picture"/>
                     <pic:cNvPicPr>
                       <a:picLocks noChangeArrowheads="1" noChangeAspect="1"/>
                     </pic:cNvPicPr>
                   </pic:nvPicPr>
                   <pic:blipFill>
-                    <a:blip r:embed="rId160"/>
+                    <a:blip r:embed="rId172"/>
                     <a:stretch>
                       <a:fillRect/>
                     </a:stretch>
@@ -5135,7 +7160,7 @@
         <w:t xml:space="preserve">Рис. 32: Проверка настройки ручного агрегирования каналов на sw-omabakumova-0</w:t>
       </w:r>
     </w:p>
-    <w:bookmarkEnd w:id="163"/>
+    <w:bookmarkEnd w:id="175"/>
     <w:p>
       <w:pPr>
         <w:pStyle w:val="BodyText"/>
@@ -5144,7 +7169,7 @@
         <w:t xml:space="preserve">Аналогичную настройку проведем на первом коммутаторе (рис. 33):</w:t>
       </w:r>
     </w:p>
-    <w:bookmarkStart w:id="167" w:name="fig:033"/>
+    <w:bookmarkStart w:id="179" w:name="fig:033"/>
     <w:p>
       <w:pPr>
         <w:pStyle w:val="CaptionedFigure"/>
@@ -5154,18 +7179,18 @@
           <wp:inline>
             <wp:extent cx="4267200" cy="1376748"/>
             <wp:effectExtent b="0" l="0" r="0" t="0"/>
-            <wp:docPr descr="Рис. 33: Настройка ручного агрегирования каналов на sw-omabakumova-1" title="" id="165" name="Picture"/>
+            <wp:docPr descr="Рис. 33: Настройка ручного агрегирования каналов на sw-omabakumova-1" title="" id="177" name="Picture"/>
             <a:graphic>
               <a:graphicData uri="http://schemas.openxmlformats.org/drawingml/2006/picture">
                 <pic:pic>
                   <pic:nvPicPr>
-                    <pic:cNvPr descr="image/33.png" id="166" name="Picture"/>
+                    <pic:cNvPr descr="image/33.png" id="178" name="Picture"/>
                     <pic:cNvPicPr>
                       <a:picLocks noChangeArrowheads="1" noChangeAspect="1"/>
                     </pic:cNvPicPr>
                   </pic:nvPicPr>
                   <pic:blipFill>
-                    <a:blip r:embed="rId164"/>
+                    <a:blip r:embed="rId176"/>
                     <a:stretch>
                       <a:fillRect/>
                     </a:stretch>
@@ -5200,8 +7225,8 @@
         <w:t xml:space="preserve">Рис. 33: Настройка ручного агрегирования каналов на sw-omabakumova-1</w:t>
       </w:r>
     </w:p>
-    <w:bookmarkEnd w:id="167"/>
-    <w:bookmarkStart w:id="171" w:name="fig:034"/>
+    <w:bookmarkEnd w:id="179"/>
+    <w:bookmarkStart w:id="183" w:name="fig:034"/>
     <w:p>
       <w:pPr>
         <w:pStyle w:val="CaptionedFigure"/>
@@ -5211,18 +7236,18 @@
           <wp:inline>
             <wp:extent cx="4267200" cy="2819592"/>
             <wp:effectExtent b="0" l="0" r="0" t="0"/>
-            <wp:docPr descr="Рис. 34: Проверка настройки ручного агрегирования каналов на sw-omabakumova-1" title="" id="169" name="Picture"/>
+            <wp:docPr descr="Рис. 34: Проверка настройки ручного агрегирования каналов на sw-omabakumova-1" title="" id="181" name="Picture"/>
             <a:graphic>
               <a:graphicData uri="http://schemas.openxmlformats.org/drawingml/2006/picture">
                 <pic:pic>
                   <pic:nvPicPr>
-                    <pic:cNvPr descr="image/34.png" id="170" name="Picture"/>
+                    <pic:cNvPr descr="image/34.png" id="182" name="Picture"/>
                     <pic:cNvPicPr>
                       <a:picLocks noChangeArrowheads="1" noChangeAspect="1"/>
                     </pic:cNvPicPr>
                   </pic:nvPicPr>
                   <pic:blipFill>
-                    <a:blip r:embed="rId168"/>
+                    <a:blip r:embed="rId180"/>
                     <a:stretch>
                       <a:fillRect/>
                     </a:stretch>
@@ -5257,7 +7282,7 @@
         <w:t xml:space="preserve">Рис. 34: Проверка настройки ручного агрегирования каналов на sw-omabakumova-1</w:t>
       </w:r>
     </w:p>
-    <w:bookmarkEnd w:id="171"/>
+    <w:bookmarkEnd w:id="183"/>
     <w:p>
       <w:pPr>
         <w:pStyle w:val="BodyText"/>
@@ -5283,10 +7308,10 @@
         <w:t xml:space="preserve">Все методы агрегирования действительно отличаются лишь небольшими нюансами в настройке. Выбор конкретного способа зависит от требований к надежности и возможностей сетевого оборудования.</w:t>
       </w:r>
     </w:p>
-    <w:bookmarkEnd w:id="172"/>
-    <w:bookmarkEnd w:id="173"/>
-    <w:bookmarkEnd w:id="174"/>
-    <w:bookmarkStart w:id="175" w:name="выводы"/>
+    <w:bookmarkEnd w:id="184"/>
+    <w:bookmarkEnd w:id="185"/>
+    <w:bookmarkEnd w:id="186"/>
+    <w:bookmarkStart w:id="187" w:name="выводы"/>
     <w:p>
       <w:pPr>
         <w:pStyle w:val="Heading1"/>
@@ -5312,8 +7337,8 @@
         <w:t xml:space="preserve">Были изучены принципы работы протокола STP (Spanning Tree Protocol) и технологий агрегирования каналов.</w:t>
       </w:r>
     </w:p>
-    <w:bookmarkEnd w:id="175"/>
-    <w:bookmarkStart w:id="191" w:name="список-литературы"/>
+    <w:bookmarkEnd w:id="187"/>
+    <w:bookmarkStart w:id="203" w:name="список-литературы"/>
     <w:p>
       <w:pPr>
         <w:pStyle w:val="Heading1"/>
@@ -5322,8 +7347,8 @@
         <w:t xml:space="preserve">Список литературы</w:t>
       </w:r>
     </w:p>
-    <w:bookmarkStart w:id="190" w:name="refs"/>
-    <w:bookmarkStart w:id="177" w:name="ref-STP"/>
+    <w:bookmarkStart w:id="202" w:name="refs"/>
+    <w:bookmarkStart w:id="189" w:name="ref-STP"/>
     <w:p>
       <w:pPr>
         <w:pStyle w:val="Bibliography"/>
@@ -5349,7 +7374,7 @@
       <w:r>
         <w:t xml:space="preserve"> </w:t>
       </w:r>
-      <w:hyperlink r:id="rId176">
+      <w:hyperlink r:id="rId188">
         <w:r>
           <w:rPr>
             <w:rStyle w:val="Hyperlink"/>
@@ -5361,8 +7386,8 @@
         <w:t xml:space="preserve">.</w:t>
       </w:r>
     </w:p>
-    <w:bookmarkEnd w:id="177"/>
-    <w:bookmarkStart w:id="179" w:name="ref-Perlman"/>
+    <w:bookmarkEnd w:id="189"/>
+    <w:bookmarkStart w:id="191" w:name="ref-Perlman"/>
     <w:p>
       <w:pPr>
         <w:pStyle w:val="Bibliography"/>
@@ -5388,7 +7413,7 @@
       <w:r>
         <w:t xml:space="preserve"> </w:t>
       </w:r>
-      <w:hyperlink r:id="rId178">
+      <w:hyperlink r:id="rId190">
         <w:r>
           <w:rPr>
             <w:rStyle w:val="Hyperlink"/>
@@ -5400,8 +7425,8 @@
         <w:t xml:space="preserve">.</w:t>
       </w:r>
     </w:p>
-    <w:bookmarkEnd w:id="179"/>
-    <w:bookmarkStart w:id="181" w:name="ref-BPDU"/>
+    <w:bookmarkEnd w:id="191"/>
+    <w:bookmarkStart w:id="193" w:name="ref-BPDU"/>
     <w:p>
       <w:pPr>
         <w:pStyle w:val="Bibliography"/>
@@ -5427,7 +7452,7 @@
       <w:r>
         <w:t xml:space="preserve"> </w:t>
       </w:r>
-      <w:hyperlink r:id="rId180">
+      <w:hyperlink r:id="rId192">
         <w:r>
           <w:rPr>
             <w:rStyle w:val="Hyperlink"/>
@@ -5439,8 +7464,8 @@
         <w:t xml:space="preserve">.</w:t>
       </w:r>
     </w:p>
-    <w:bookmarkEnd w:id="181"/>
-    <w:bookmarkStart w:id="183" w:name="ref-STP_Cisco"/>
+    <w:bookmarkEnd w:id="193"/>
+    <w:bookmarkStart w:id="195" w:name="ref-STP_Cisco"/>
     <w:p>
       <w:pPr>
         <w:pStyle w:val="Bibliography"/>
@@ -5466,7 +7491,7 @@
       <w:r>
         <w:t xml:space="preserve"> </w:t>
       </w:r>
-      <w:hyperlink r:id="rId182">
+      <w:hyperlink r:id="rId194">
         <w:r>
           <w:rPr>
             <w:rStyle w:val="Hyperlink"/>
@@ -5478,8 +7503,8 @@
         <w:t xml:space="preserve">.</w:t>
       </w:r>
     </w:p>
-    <w:bookmarkEnd w:id="183"/>
-    <w:bookmarkStart w:id="185" w:name="ref-RSTP"/>
+    <w:bookmarkEnd w:id="195"/>
+    <w:bookmarkStart w:id="197" w:name="ref-RSTP"/>
     <w:p>
       <w:pPr>
         <w:pStyle w:val="Bibliography"/>
@@ -5505,7 +7530,7 @@
       <w:r>
         <w:t xml:space="preserve"> </w:t>
       </w:r>
-      <w:hyperlink r:id="rId184">
+      <w:hyperlink r:id="rId196">
         <w:r>
           <w:rPr>
             <w:rStyle w:val="Hyperlink"/>
@@ -5517,8 +7542,8 @@
         <w:t xml:space="preserve">.</w:t>
       </w:r>
     </w:p>
-    <w:bookmarkEnd w:id="185"/>
-    <w:bookmarkStart w:id="187" w:name="ref-Aggregation"/>
+    <w:bookmarkEnd w:id="197"/>
+    <w:bookmarkStart w:id="199" w:name="ref-Aggregation"/>
     <w:p>
       <w:pPr>
         <w:pStyle w:val="Bibliography"/>
@@ -5544,7 +7569,7 @@
       <w:r>
         <w:t xml:space="preserve"> </w:t>
       </w:r>
-      <w:hyperlink r:id="rId186">
+      <w:hyperlink r:id="rId198">
         <w:r>
           <w:rPr>
             <w:rStyle w:val="Hyperlink"/>
@@ -5556,8 +7581,8 @@
         <w:t xml:space="preserve">.</w:t>
       </w:r>
     </w:p>
-    <w:bookmarkEnd w:id="187"/>
-    <w:bookmarkStart w:id="189" w:name="ref-kulyabov2017"/>
+    <w:bookmarkEnd w:id="199"/>
+    <w:bookmarkStart w:id="201" w:name="ref-kulyabov2017"/>
     <w:p>
       <w:pPr>
         <w:pStyle w:val="Bibliography"/>
@@ -5577,7 +7602,7 @@
       <w:r>
         <w:t xml:space="preserve"> </w:t>
       </w:r>
-      <w:hyperlink r:id="rId188">
+      <w:hyperlink r:id="rId200">
         <w:r>
           <w:rPr>
             <w:rStyle w:val="Hyperlink"/>
@@ -5589,9 +7614,9 @@
         <w:t xml:space="preserve">. М.: Российский университет дружбы народов, 2017. 119 с.</w:t>
       </w:r>
     </w:p>
-    <w:bookmarkEnd w:id="189"/>
-    <w:bookmarkEnd w:id="190"/>
-    <w:bookmarkEnd w:id="191"/>
+    <w:bookmarkEnd w:id="201"/>
+    <w:bookmarkEnd w:id="202"/>
+    <w:bookmarkEnd w:id="203"/>
     <w:sectPr>
       <w:footnotePr>
         <w:numRestart w:val="eachSect"/>
@@ -6890,67 +8915,13 @@
     <w:abstractNumId w:val="991"/>
   </w:num>
   <w:num w:numId="1028">
-    <w:abstractNumId w:val="99411"/>
-    <w:lvlOverride w:ilvl="0">
-      <w:startOverride w:val="1"/>
-    </w:lvlOverride>
-    <w:lvlOverride w:ilvl="1">
-      <w:startOverride w:val="1"/>
-    </w:lvlOverride>
-    <w:lvlOverride w:ilvl="2">
-      <w:startOverride w:val="1"/>
-    </w:lvlOverride>
-    <w:lvlOverride w:ilvl="3">
-      <w:startOverride w:val="1"/>
-    </w:lvlOverride>
-    <w:lvlOverride w:ilvl="4">
-      <w:startOverride w:val="1"/>
-    </w:lvlOverride>
-    <w:lvlOverride w:ilvl="5">
-      <w:startOverride w:val="1"/>
-    </w:lvlOverride>
-    <w:lvlOverride w:ilvl="6">
-      <w:startOverride w:val="1"/>
-    </w:lvlOverride>
-    <w:lvlOverride w:ilvl="7">
-      <w:startOverride w:val="1"/>
-    </w:lvlOverride>
-    <w:lvlOverride w:ilvl="8">
-      <w:startOverride w:val="1"/>
-    </w:lvlOverride>
+    <w:abstractNumId w:val="991"/>
   </w:num>
   <w:num w:numId="1029">
     <w:abstractNumId w:val="991"/>
   </w:num>
   <w:num w:numId="1030">
-    <w:abstractNumId w:val="99412"/>
-    <w:lvlOverride w:ilvl="0">
-      <w:startOverride w:val="2"/>
-    </w:lvlOverride>
-    <w:lvlOverride w:ilvl="1">
-      <w:startOverride w:val="2"/>
-    </w:lvlOverride>
-    <w:lvlOverride w:ilvl="2">
-      <w:startOverride w:val="2"/>
-    </w:lvlOverride>
-    <w:lvlOverride w:ilvl="3">
-      <w:startOverride w:val="2"/>
-    </w:lvlOverride>
-    <w:lvlOverride w:ilvl="4">
-      <w:startOverride w:val="2"/>
-    </w:lvlOverride>
-    <w:lvlOverride w:ilvl="5">
-      <w:startOverride w:val="2"/>
-    </w:lvlOverride>
-    <w:lvlOverride w:ilvl="6">
-      <w:startOverride w:val="2"/>
-    </w:lvlOverride>
-    <w:lvlOverride w:ilvl="7">
-      <w:startOverride w:val="2"/>
-    </w:lvlOverride>
-    <w:lvlOverride w:ilvl="8">
-      <w:startOverride w:val="2"/>
-    </w:lvlOverride>
+    <w:abstractNumId w:val="991"/>
   </w:num>
   <w:num w:numId="1031">
     <w:abstractNumId w:val="991"/>
@@ -6959,34 +8930,7 @@
     <w:abstractNumId w:val="991"/>
   </w:num>
   <w:num w:numId="1033">
-    <w:abstractNumId w:val="99411"/>
-    <w:lvlOverride w:ilvl="0">
-      <w:startOverride w:val="1"/>
-    </w:lvlOverride>
-    <w:lvlOverride w:ilvl="1">
-      <w:startOverride w:val="1"/>
-    </w:lvlOverride>
-    <w:lvlOverride w:ilvl="2">
-      <w:startOverride w:val="1"/>
-    </w:lvlOverride>
-    <w:lvlOverride w:ilvl="3">
-      <w:startOverride w:val="1"/>
-    </w:lvlOverride>
-    <w:lvlOverride w:ilvl="4">
-      <w:startOverride w:val="1"/>
-    </w:lvlOverride>
-    <w:lvlOverride w:ilvl="5">
-      <w:startOverride w:val="1"/>
-    </w:lvlOverride>
-    <w:lvlOverride w:ilvl="6">
-      <w:startOverride w:val="1"/>
-    </w:lvlOverride>
-    <w:lvlOverride w:ilvl="7">
-      <w:startOverride w:val="1"/>
-    </w:lvlOverride>
-    <w:lvlOverride w:ilvl="8">
-      <w:startOverride w:val="1"/>
-    </w:lvlOverride>
+    <w:abstractNumId w:val="991"/>
   </w:num>
   <w:num w:numId="1034">
     <w:abstractNumId w:val="991"/>
@@ -6995,72 +8939,57 @@
     <w:abstractNumId w:val="991"/>
   </w:num>
   <w:num w:numId="1036">
-    <w:abstractNumId w:val="99412"/>
-    <w:lvlOverride w:ilvl="0">
-      <w:startOverride w:val="2"/>
-    </w:lvlOverride>
-    <w:lvlOverride w:ilvl="1">
-      <w:startOverride w:val="2"/>
-    </w:lvlOverride>
-    <w:lvlOverride w:ilvl="2">
-      <w:startOverride w:val="2"/>
-    </w:lvlOverride>
-    <w:lvlOverride w:ilvl="3">
-      <w:startOverride w:val="2"/>
-    </w:lvlOverride>
-    <w:lvlOverride w:ilvl="4">
-      <w:startOverride w:val="2"/>
-    </w:lvlOverride>
-    <w:lvlOverride w:ilvl="5">
-      <w:startOverride w:val="2"/>
-    </w:lvlOverride>
-    <w:lvlOverride w:ilvl="6">
-      <w:startOverride w:val="2"/>
-    </w:lvlOverride>
-    <w:lvlOverride w:ilvl="7">
-      <w:startOverride w:val="2"/>
-    </w:lvlOverride>
-    <w:lvlOverride w:ilvl="8">
-      <w:startOverride w:val="2"/>
-    </w:lvlOverride>
+    <w:abstractNumId w:val="991"/>
   </w:num>
   <w:num w:numId="1037">
     <w:abstractNumId w:val="991"/>
   </w:num>
   <w:num w:numId="1038">
-    <w:abstractNumId w:val="99413"/>
-    <w:lvlOverride w:ilvl="0">
-      <w:startOverride w:val="3"/>
-    </w:lvlOverride>
-    <w:lvlOverride w:ilvl="1">
-      <w:startOverride w:val="3"/>
-    </w:lvlOverride>
-    <w:lvlOverride w:ilvl="2">
-      <w:startOverride w:val="3"/>
-    </w:lvlOverride>
-    <w:lvlOverride w:ilvl="3">
-      <w:startOverride w:val="3"/>
-    </w:lvlOverride>
-    <w:lvlOverride w:ilvl="4">
-      <w:startOverride w:val="3"/>
-    </w:lvlOverride>
-    <w:lvlOverride w:ilvl="5">
-      <w:startOverride w:val="3"/>
-    </w:lvlOverride>
-    <w:lvlOverride w:ilvl="6">
-      <w:startOverride w:val="3"/>
-    </w:lvlOverride>
-    <w:lvlOverride w:ilvl="7">
-      <w:startOverride w:val="3"/>
-    </w:lvlOverride>
-    <w:lvlOverride w:ilvl="8">
-      <w:startOverride w:val="3"/>
-    </w:lvlOverride>
+    <w:abstractNumId w:val="991"/>
   </w:num>
   <w:num w:numId="1039">
     <w:abstractNumId w:val="991"/>
   </w:num>
   <w:num w:numId="1040">
+    <w:abstractNumId w:val="991"/>
+  </w:num>
+  <w:num w:numId="1041">
+    <w:abstractNumId w:val="991"/>
+  </w:num>
+  <w:num w:numId="1042">
+    <w:abstractNumId w:val="991"/>
+  </w:num>
+  <w:num w:numId="1043">
+    <w:abstractNumId w:val="991"/>
+  </w:num>
+  <w:num w:numId="1044">
+    <w:abstractNumId w:val="991"/>
+  </w:num>
+  <w:num w:numId="1045">
+    <w:abstractNumId w:val="991"/>
+  </w:num>
+  <w:num w:numId="1046">
+    <w:abstractNumId w:val="991"/>
+  </w:num>
+  <w:num w:numId="1047">
+    <w:abstractNumId w:val="991"/>
+  </w:num>
+  <w:num w:numId="1048">
+    <w:abstractNumId w:val="991"/>
+  </w:num>
+  <w:num w:numId="1049">
+    <w:abstractNumId w:val="991"/>
+  </w:num>
+  <w:num w:numId="1050">
+    <w:abstractNumId w:val="991"/>
+  </w:num>
+  <w:num w:numId="1051">
+    <w:abstractNumId w:val="991"/>
+  </w:num>
+  <w:num w:numId="1052">
+    <w:abstractNumId w:val="991"/>
+  </w:num>
+  <w:num w:numId="1053">
     <w:abstractNumId w:val="99411"/>
     <w:lvlOverride w:ilvl="0">
       <w:startOverride w:val="1"/>
@@ -7090,7 +9019,178 @@
       <w:startOverride w:val="1"/>
     </w:lvlOverride>
   </w:num>
-  <w:num w:numId="1041">
+  <w:num w:numId="1054">
+    <w:abstractNumId w:val="991"/>
+  </w:num>
+  <w:num w:numId="1055">
+    <w:abstractNumId w:val="99412"/>
+    <w:lvlOverride w:ilvl="0">
+      <w:startOverride w:val="2"/>
+    </w:lvlOverride>
+    <w:lvlOverride w:ilvl="1">
+      <w:startOverride w:val="2"/>
+    </w:lvlOverride>
+    <w:lvlOverride w:ilvl="2">
+      <w:startOverride w:val="2"/>
+    </w:lvlOverride>
+    <w:lvlOverride w:ilvl="3">
+      <w:startOverride w:val="2"/>
+    </w:lvlOverride>
+    <w:lvlOverride w:ilvl="4">
+      <w:startOverride w:val="2"/>
+    </w:lvlOverride>
+    <w:lvlOverride w:ilvl="5">
+      <w:startOverride w:val="2"/>
+    </w:lvlOverride>
+    <w:lvlOverride w:ilvl="6">
+      <w:startOverride w:val="2"/>
+    </w:lvlOverride>
+    <w:lvlOverride w:ilvl="7">
+      <w:startOverride w:val="2"/>
+    </w:lvlOverride>
+    <w:lvlOverride w:ilvl="8">
+      <w:startOverride w:val="2"/>
+    </w:lvlOverride>
+  </w:num>
+  <w:num w:numId="1056">
+    <w:abstractNumId w:val="991"/>
+  </w:num>
+  <w:num w:numId="1057">
+    <w:abstractNumId w:val="991"/>
+  </w:num>
+  <w:num w:numId="1058">
+    <w:abstractNumId w:val="99411"/>
+    <w:lvlOverride w:ilvl="0">
+      <w:startOverride w:val="1"/>
+    </w:lvlOverride>
+    <w:lvlOverride w:ilvl="1">
+      <w:startOverride w:val="1"/>
+    </w:lvlOverride>
+    <w:lvlOverride w:ilvl="2">
+      <w:startOverride w:val="1"/>
+    </w:lvlOverride>
+    <w:lvlOverride w:ilvl="3">
+      <w:startOverride w:val="1"/>
+    </w:lvlOverride>
+    <w:lvlOverride w:ilvl="4">
+      <w:startOverride w:val="1"/>
+    </w:lvlOverride>
+    <w:lvlOverride w:ilvl="5">
+      <w:startOverride w:val="1"/>
+    </w:lvlOverride>
+    <w:lvlOverride w:ilvl="6">
+      <w:startOverride w:val="1"/>
+    </w:lvlOverride>
+    <w:lvlOverride w:ilvl="7">
+      <w:startOverride w:val="1"/>
+    </w:lvlOverride>
+    <w:lvlOverride w:ilvl="8">
+      <w:startOverride w:val="1"/>
+    </w:lvlOverride>
+  </w:num>
+  <w:num w:numId="1059">
+    <w:abstractNumId w:val="991"/>
+  </w:num>
+  <w:num w:numId="1060">
+    <w:abstractNumId w:val="991"/>
+  </w:num>
+  <w:num w:numId="1061">
+    <w:abstractNumId w:val="99412"/>
+    <w:lvlOverride w:ilvl="0">
+      <w:startOverride w:val="2"/>
+    </w:lvlOverride>
+    <w:lvlOverride w:ilvl="1">
+      <w:startOverride w:val="2"/>
+    </w:lvlOverride>
+    <w:lvlOverride w:ilvl="2">
+      <w:startOverride w:val="2"/>
+    </w:lvlOverride>
+    <w:lvlOverride w:ilvl="3">
+      <w:startOverride w:val="2"/>
+    </w:lvlOverride>
+    <w:lvlOverride w:ilvl="4">
+      <w:startOverride w:val="2"/>
+    </w:lvlOverride>
+    <w:lvlOverride w:ilvl="5">
+      <w:startOverride w:val="2"/>
+    </w:lvlOverride>
+    <w:lvlOverride w:ilvl="6">
+      <w:startOverride w:val="2"/>
+    </w:lvlOverride>
+    <w:lvlOverride w:ilvl="7">
+      <w:startOverride w:val="2"/>
+    </w:lvlOverride>
+    <w:lvlOverride w:ilvl="8">
+      <w:startOverride w:val="2"/>
+    </w:lvlOverride>
+  </w:num>
+  <w:num w:numId="1062">
+    <w:abstractNumId w:val="991"/>
+  </w:num>
+  <w:num w:numId="1063">
+    <w:abstractNumId w:val="99413"/>
+    <w:lvlOverride w:ilvl="0">
+      <w:startOverride w:val="3"/>
+    </w:lvlOverride>
+    <w:lvlOverride w:ilvl="1">
+      <w:startOverride w:val="3"/>
+    </w:lvlOverride>
+    <w:lvlOverride w:ilvl="2">
+      <w:startOverride w:val="3"/>
+    </w:lvlOverride>
+    <w:lvlOverride w:ilvl="3">
+      <w:startOverride w:val="3"/>
+    </w:lvlOverride>
+    <w:lvlOverride w:ilvl="4">
+      <w:startOverride w:val="3"/>
+    </w:lvlOverride>
+    <w:lvlOverride w:ilvl="5">
+      <w:startOverride w:val="3"/>
+    </w:lvlOverride>
+    <w:lvlOverride w:ilvl="6">
+      <w:startOverride w:val="3"/>
+    </w:lvlOverride>
+    <w:lvlOverride w:ilvl="7">
+      <w:startOverride w:val="3"/>
+    </w:lvlOverride>
+    <w:lvlOverride w:ilvl="8">
+      <w:startOverride w:val="3"/>
+    </w:lvlOverride>
+  </w:num>
+  <w:num w:numId="1064">
+    <w:abstractNumId w:val="991"/>
+  </w:num>
+  <w:num w:numId="1065">
+    <w:abstractNumId w:val="99411"/>
+    <w:lvlOverride w:ilvl="0">
+      <w:startOverride w:val="1"/>
+    </w:lvlOverride>
+    <w:lvlOverride w:ilvl="1">
+      <w:startOverride w:val="1"/>
+    </w:lvlOverride>
+    <w:lvlOverride w:ilvl="2">
+      <w:startOverride w:val="1"/>
+    </w:lvlOverride>
+    <w:lvlOverride w:ilvl="3">
+      <w:startOverride w:val="1"/>
+    </w:lvlOverride>
+    <w:lvlOverride w:ilvl="4">
+      <w:startOverride w:val="1"/>
+    </w:lvlOverride>
+    <w:lvlOverride w:ilvl="5">
+      <w:startOverride w:val="1"/>
+    </w:lvlOverride>
+    <w:lvlOverride w:ilvl="6">
+      <w:startOverride w:val="1"/>
+    </w:lvlOverride>
+    <w:lvlOverride w:ilvl="7">
+      <w:startOverride w:val="1"/>
+    </w:lvlOverride>
+    <w:lvlOverride w:ilvl="8">
+      <w:startOverride w:val="1"/>
+    </w:lvlOverride>
+  </w:num>
+  <w:num w:numId="1066">
     <w:abstractNumId w:val="991"/>
   </w:num>
 </w:numbering>

</xml_diff>